<commit_message>
Enfoca el informe FACSO en Asunción y el área metropolitana (Gran Asunción)
- La Parte A ("qué significa") se reorienta al Gran Asunción: inundación pluvial
  urbana (raudales), fluvial (bañados Norte/Sur, La Chacarita) y dengue periurbano;
  respuesta metropolitana de la SEN/Municipalidad. La lectura del pronóstico se ancla
  al Gran Asunción. Coherente con la ubicación de la comunidad de la FACSO-UNA.

Co-Authored-By: Claude Opus 4.8 <noreply@anthropic.com>
</commit_message>
<xml_diff>
--- a/informes/informe-elnino-facso-una.docx
+++ b/informes/informe-elnino-facso-una.docx
@@ -44,7 +44,7 @@
         <w:t xml:space="preserve">2026-07-01</w:t>
       </w:r>
     </w:p>
-    <w:bookmarkStart w:id="16" w:name="X6ebb0b0fd9c1e49f040bb5692c31db3ccbd88cd"/>
+    <w:bookmarkStart w:id="15" w:name="X6ebb0b0fd9c1e49f040bb5692c31db3ccbd88cd"/>
     <w:p>
       <w:pPr>
         <w:pStyle w:val="Heading1"/>
@@ -499,45 +499,185 @@
           <w:b/>
           <w:bCs/>
         </w:rPr>
-        <w:t xml:space="preserve">Qué significa para Paraguay.</w:t>
-      </w:r>
-      <w:r>
-        <w:t xml:space="preserve"> </w:t>
-      </w:r>
-      <w:r>
-        <w:t xml:space="preserve">Primavera y verano</w:t>
-      </w:r>
-      <w:r>
-        <w:t xml:space="preserve"> </w:t>
-      </w:r>
-      <w:r>
-        <w:rPr>
-          <w:b/>
-          <w:bCs/>
-        </w:rPr>
-        <w:t xml:space="preserve">lluviosos</w:t>
-      </w:r>
-      <w:r>
-        <w:t xml:space="preserve">, con inundaciones en</w:t>
-      </w:r>
-      <w:r>
-        <w:t xml:space="preserve"> </w:t>
-      </w:r>
-      <w:r>
-        <w:t xml:space="preserve">los puntos críticos de</w:t>
-      </w:r>
-      <w:r>
-        <w:t xml:space="preserve"> </w:t>
-      </w:r>
-      <w:r>
-        <w:rPr>
-          <w:b/>
-          <w:bCs/>
-        </w:rPr>
-        <w:t xml:space="preserve">Asunción y Central</w:t>
-      </w:r>
-      <w:r>
-        <w:t xml:space="preserve">, hasta</w:t>
+        <w:t xml:space="preserve">Qué significa para Asunción y el área metropolitana.</w:t>
+      </w:r>
+      <w:r>
+        <w:t xml:space="preserve"> </w:t>
+      </w:r>
+      <w:r>
+        <w:t xml:space="preserve">El ámbito de interés es el</w:t>
+      </w:r>
+      <w:r>
+        <w:t xml:space="preserve"> </w:t>
+      </w:r>
+      <w:r>
+        <w:rPr>
+          <w:b/>
+          <w:bCs/>
+        </w:rPr>
+        <w:t xml:space="preserve">Gran Asunción</w:t>
+      </w:r>
+      <w:r>
+        <w:t xml:space="preserve"> </w:t>
+      </w:r>
+      <w:r>
+        <w:t xml:space="preserve">(la capital y los municipios de Central), donde se concentran la</w:t>
+      </w:r>
+      <w:r>
+        <w:t xml:space="preserve"> </w:t>
+      </w:r>
+      <w:r>
+        <w:t xml:space="preserve">población, los servicios y la comunidad universitaria. Allí la primavera-verano lluviosa</w:t>
+      </w:r>
+      <w:r>
+        <w:t xml:space="preserve"> </w:t>
+      </w:r>
+      <w:r>
+        <w:t xml:space="preserve">se traduce en</w:t>
+      </w:r>
+      <w:r>
+        <w:t xml:space="preserve"> </w:t>
+      </w:r>
+      <w:r>
+        <w:rPr>
+          <w:b/>
+          <w:bCs/>
+        </w:rPr>
+        <w:t xml:space="preserve">inundación pluvial urbana</w:t>
+      </w:r>
+      <w:r>
+        <w:t xml:space="preserve"> </w:t>
+      </w:r>
+      <w:r>
+        <w:t xml:space="preserve">—raudales por lluvia intensa sobre un drenaje</w:t>
+      </w:r>
+      <w:r>
+        <w:t xml:space="preserve"> </w:t>
+      </w:r>
+      <w:r>
+        <w:t xml:space="preserve">insuficiente, que anegan calles y los puntos críticos de Asunción y ciudades de Central—</w:t>
+      </w:r>
+      <w:r>
+        <w:t xml:space="preserve"> </w:t>
+      </w:r>
+      <w:r>
+        <w:t xml:space="preserve">y en</w:t>
+      </w:r>
+      <w:r>
+        <w:t xml:space="preserve"> </w:t>
+      </w:r>
+      <w:r>
+        <w:rPr>
+          <w:b/>
+          <w:bCs/>
+        </w:rPr>
+        <w:t xml:space="preserve">inundación fluvial</w:t>
+      </w:r>
+      <w:r>
+        <w:t xml:space="preserve"> </w:t>
+      </w:r>
+      <w:r>
+        <w:t xml:space="preserve">—la crecida del río Paraguay sobre los</w:t>
+      </w:r>
+      <w:r>
+        <w:t xml:space="preserve"> </w:t>
+      </w:r>
+      <w:r>
+        <w:rPr>
+          <w:b/>
+          <w:bCs/>
+        </w:rPr>
+        <w:t xml:space="preserve">bañados Norte y Sur</w:t>
+      </w:r>
+      <w:r>
+        <w:rPr>
+          <w:b/>
+          <w:bCs/>
+        </w:rPr>
+        <w:t xml:space="preserve"> </w:t>
+      </w:r>
+      <w:r>
+        <w:rPr>
+          <w:b/>
+          <w:bCs/>
+        </w:rPr>
+        <w:t xml:space="preserve">y La Chacarita</w:t>
+      </w:r>
+      <w:r>
+        <w:t xml:space="preserve">—, además del</w:t>
+      </w:r>
+      <w:r>
+        <w:t xml:space="preserve"> </w:t>
+      </w:r>
+      <w:r>
+        <w:rPr>
+          <w:b/>
+          <w:bCs/>
+        </w:rPr>
+        <w:t xml:space="preserve">dengue</w:t>
+      </w:r>
+      <w:r>
+        <w:t xml:space="preserve"> </w:t>
+      </w:r>
+      <w:r>
+        <w:t xml:space="preserve">en el periurbano (agua estancada + calor). La</w:t>
+      </w:r>
+      <w:r>
+        <w:t xml:space="preserve"> </w:t>
+      </w:r>
+      <w:r>
+        <w:rPr>
+          <w:b/>
+          <w:bCs/>
+        </w:rPr>
+        <w:t xml:space="preserve">SEN</w:t>
+      </w:r>
+      <w:r>
+        <w:t xml:space="preserve"> </w:t>
+      </w:r>
+      <w:r>
+        <w:t xml:space="preserve">prepara la respuesta metropolitana (limpieza de cauces y albergues con la</w:t>
+      </w:r>
+      <w:r>
+        <w:t xml:space="preserve"> </w:t>
+      </w:r>
+      <w:r>
+        <w:t xml:space="preserve">Municipalidad de Asunción); con el río en</w:t>
+      </w:r>
+      <w:r>
+        <w:t xml:space="preserve"> </w:t>
+      </w:r>
+      <w:r>
+        <w:rPr>
+          <w:b/>
+          <w:bCs/>
+        </w:rPr>
+        <w:t xml:space="preserve">5 m</w:t>
+      </w:r>
+      <w:r>
+        <w:t xml:space="preserve">, unas</w:t>
+      </w:r>
+      <w:r>
+        <w:t xml:space="preserve"> </w:t>
+      </w:r>
+      <w:r>
+        <w:rPr>
+          <w:b/>
+          <w:bCs/>
+        </w:rPr>
+        <w:t xml:space="preserve">2.000 viviendas</w:t>
+      </w:r>
+      <w:r>
+        <w:t xml:space="preserve"> </w:t>
+      </w:r>
+      <w:r>
+        <w:t xml:space="preserve">de Asunción</w:t>
+      </w:r>
+      <w:r>
+        <w:t xml:space="preserve"> </w:t>
+      </w:r>
+      <w:r>
+        <w:t xml:space="preserve">podrían afectarse, y el episodio se extendería hasta</w:t>
       </w:r>
       <w:r>
         <w:t xml:space="preserve"> </w:t>
@@ -560,69 +700,129 @@
           <w:rPr>
             <w:rStyle w:val="Hyperlink"/>
           </w:rPr>
-          <w:t xml:space="preserve">DINAC vía prensa</w:t>
+          <w:t xml:space="preserve">DINAC/SEN vía prensa</w:t>
         </w:r>
       </w:hyperlink>
       <w:r>
         <w:t xml:space="preserve">).</w:t>
       </w:r>
-      <w:r>
-        <w:t xml:space="preserve"> </w:t>
-      </w:r>
-      <w:r>
-        <w:t xml:space="preserve">Se encadenan tres amenazas:</w:t>
-      </w:r>
-      <w:r>
-        <w:t xml:space="preserve"> </w:t>
-      </w:r>
-      <w:r>
-        <w:rPr>
-          <w:b/>
-          <w:bCs/>
-        </w:rPr>
-        <w:t xml:space="preserve">inundación pluvial urbana</w:t>
-      </w:r>
-      <w:r>
-        <w:t xml:space="preserve"> </w:t>
-      </w:r>
-      <w:r>
-        <w:t xml:space="preserve">(raudales por lluvia intensa),</w:t>
-      </w:r>
-      <w:r>
-        <w:t xml:space="preserve"> </w:t>
-      </w:r>
-      <w:r>
-        <w:rPr>
-          <w:b/>
-          <w:bCs/>
-        </w:rPr>
-        <w:t xml:space="preserve">inundación fluvial</w:t>
-      </w:r>
-      <w:r>
-        <w:t xml:space="preserve"> </w:t>
-      </w:r>
-      <w:r>
-        <w:t xml:space="preserve">(crecida del río Paraguay) y</w:t>
-      </w:r>
-      <w:r>
-        <w:t xml:space="preserve"> </w:t>
-      </w:r>
-      <w:r>
-        <w:rPr>
-          <w:b/>
-          <w:bCs/>
-        </w:rPr>
-        <w:t xml:space="preserve">dengue</w:t>
-      </w:r>
-      <w:r>
-        <w:t xml:space="preserve"> </w:t>
-      </w:r>
-      <w:r>
-        <w:t xml:space="preserve">(agua estancada + calor).</w:t>
-      </w:r>
-      <w:r>
-        <w:t xml:space="preserve"> </w:t>
-      </w:r>
+    </w:p>
+    <w:p>
+      <w:pPr>
+        <w:pStyle w:val="BodyText"/>
+      </w:pPr>
+      <w:r>
+        <w:rPr>
+          <w:b/>
+          <w:bCs/>
+        </w:rPr>
+        <w:t xml:space="preserve">Lectura.</w:t>
+      </w:r>
+      <w:r>
+        <w:t xml:space="preserve"> </w:t>
+      </w:r>
+      <w:r>
+        <w:t xml:space="preserve">El pronóstico es</w:t>
+      </w:r>
+      <w:r>
+        <w:t xml:space="preserve"> </w:t>
+      </w:r>
+      <w:r>
+        <w:rPr>
+          <w:b/>
+          <w:bCs/>
+        </w:rPr>
+        <w:t xml:space="preserve">probabilístico</w:t>
+      </w:r>
+      <w:r>
+        <w:t xml:space="preserve"> </w:t>
+      </w:r>
+      <w:r>
+        <w:t xml:space="preserve">—inclina la balanza, no fija el día—; en</w:t>
+      </w:r>
+      <w:r>
+        <w:t xml:space="preserve"> </w:t>
+      </w:r>
+      <w:r>
+        <w:t xml:space="preserve">el</w:t>
+      </w:r>
+      <w:r>
+        <w:t xml:space="preserve"> </w:t>
+      </w:r>
+      <w:r>
+        <w:rPr>
+          <w:b/>
+          <w:bCs/>
+        </w:rPr>
+        <w:t xml:space="preserve">Gran Asunción</w:t>
+      </w:r>
+      <w:r>
+        <w:t xml:space="preserve"> </w:t>
+      </w:r>
+      <w:r>
+        <w:t xml:space="preserve">el riesgo operativo son los</w:t>
+      </w:r>
+      <w:r>
+        <w:t xml:space="preserve"> </w:t>
+      </w:r>
+      <w:r>
+        <w:rPr>
+          <w:b/>
+          <w:bCs/>
+        </w:rPr>
+        <w:t xml:space="preserve">eventos de lluvia intensa</w:t>
+      </w:r>
+      <w:r>
+        <w:t xml:space="preserve"> </w:t>
+      </w:r>
+      <w:r>
+        <w:t xml:space="preserve">(temporales</w:t>
+      </w:r>
+      <w:r>
+        <w:t xml:space="preserve"> </w:t>
+      </w:r>
+      <w:r>
+        <w:t xml:space="preserve">y raudales), más probables esta temporada. El desastre está</w:t>
+      </w:r>
+      <w:r>
+        <w:t xml:space="preserve"> </w:t>
+      </w:r>
+      <w:r>
+        <w:rPr>
+          <w:b/>
+          <w:bCs/>
+        </w:rPr>
+        <w:t xml:space="preserve">anunciado</w:t>
+      </w:r>
+      <w:r>
+        <w:t xml:space="preserve">: el clima se</w:t>
+      </w:r>
+      <w:r>
+        <w:t xml:space="preserve"> </w:t>
+      </w:r>
+      <w:r>
+        <w:t xml:space="preserve">pronostica y la vulnerabilidad se conoce.</w:t>
+      </w:r>
+    </w:p>
+    <w:p>
+      <w:r>
+        <w:br w:type="page"/>
+      </w:r>
+    </w:p>
+    <w:bookmarkEnd w:id="15"/>
+    <w:bookmarkStart w:id="23" w:name="X0cf2b25fa38a48424544e6514685921bd9ac587"/>
+    <w:p>
+      <w:pPr>
+        <w:pStyle w:val="Heading1"/>
+      </w:pPr>
+      <w:r>
+        <w:t xml:space="preserve">Recomendaciones para la comunidad académica de la Facultad de Ciencias Sociales (UNA)</w:t>
+      </w:r>
+    </w:p>
+    <w:p>
+      <w:pPr>
+        <w:pStyle w:val="FirstParagraph"/>
+      </w:pPr>
       <w:r>
         <w:t xml:space="preserve">La</w:t>
       </w:r>
@@ -634,177 +834,6 @@
           <w:b/>
           <w:bCs/>
         </w:rPr>
-        <w:t xml:space="preserve">SEN</w:t>
-      </w:r>
-      <w:r>
-        <w:t xml:space="preserve"> </w:t>
-      </w:r>
-      <w:r>
-        <w:t xml:space="preserve">ya limpia cauces e identifica albergues; con el río en</w:t>
-      </w:r>
-      <w:r>
-        <w:t xml:space="preserve"> </w:t>
-      </w:r>
-      <w:r>
-        <w:rPr>
-          <w:b/>
-          <w:bCs/>
-        </w:rPr>
-        <w:t xml:space="preserve">5 m</w:t>
-      </w:r>
-      <w:r>
-        <w:t xml:space="preserve">, unas</w:t>
-      </w:r>
-      <w:r>
-        <w:t xml:space="preserve"> </w:t>
-      </w:r>
-      <w:r>
-        <w:rPr>
-          <w:b/>
-          <w:bCs/>
-        </w:rPr>
-        <w:t xml:space="preserve">2.000</w:t>
-      </w:r>
-      <w:r>
-        <w:rPr>
-          <w:b/>
-          <w:bCs/>
-        </w:rPr>
-        <w:t xml:space="preserve"> </w:t>
-      </w:r>
-      <w:r>
-        <w:rPr>
-          <w:b/>
-          <w:bCs/>
-        </w:rPr>
-        <w:t xml:space="preserve">viviendas</w:t>
-      </w:r>
-      <w:r>
-        <w:t xml:space="preserve"> </w:t>
-      </w:r>
-      <w:r>
-        <w:t xml:space="preserve">podrían afectarse</w:t>
-      </w:r>
-      <w:r>
-        <w:t xml:space="preserve"> </w:t>
-      </w:r>
-      <w:r>
-        <w:t xml:space="preserve">(</w:t>
-      </w:r>
-      <w:hyperlink r:id="rId15">
-        <w:r>
-          <w:rPr>
-            <w:rStyle w:val="Hyperlink"/>
-          </w:rPr>
-          <w:t xml:space="preserve">SEN</w:t>
-        </w:r>
-      </w:hyperlink>
-      <w:r>
-        <w:t xml:space="preserve">).</w:t>
-      </w:r>
-    </w:p>
-    <w:p>
-      <w:pPr>
-        <w:pStyle w:val="BodyText"/>
-      </w:pPr>
-      <w:r>
-        <w:rPr>
-          <w:b/>
-          <w:bCs/>
-        </w:rPr>
-        <w:t xml:space="preserve">Lectura.</w:t>
-      </w:r>
-      <w:r>
-        <w:t xml:space="preserve"> </w:t>
-      </w:r>
-      <w:r>
-        <w:t xml:space="preserve">El pronóstico es</w:t>
-      </w:r>
-      <w:r>
-        <w:t xml:space="preserve"> </w:t>
-      </w:r>
-      <w:r>
-        <w:rPr>
-          <w:b/>
-          <w:bCs/>
-        </w:rPr>
-        <w:t xml:space="preserve">probabilístico</w:t>
-      </w:r>
-      <w:r>
-        <w:t xml:space="preserve"> </w:t>
-      </w:r>
-      <w:r>
-        <w:t xml:space="preserve">—inclina la balanza, no fija el día—; el</w:t>
-      </w:r>
-      <w:r>
-        <w:t xml:space="preserve"> </w:t>
-      </w:r>
-      <w:r>
-        <w:t xml:space="preserve">riesgo operativo son los</w:t>
-      </w:r>
-      <w:r>
-        <w:t xml:space="preserve"> </w:t>
-      </w:r>
-      <w:r>
-        <w:rPr>
-          <w:b/>
-          <w:bCs/>
-        </w:rPr>
-        <w:t xml:space="preserve">eventos de lluvia intensa</w:t>
-      </w:r>
-      <w:r>
-        <w:t xml:space="preserve">, más probables esta temporada. El</w:t>
-      </w:r>
-      <w:r>
-        <w:t xml:space="preserve"> </w:t>
-      </w:r>
-      <w:r>
-        <w:t xml:space="preserve">desastre está</w:t>
-      </w:r>
-      <w:r>
-        <w:t xml:space="preserve"> </w:t>
-      </w:r>
-      <w:r>
-        <w:rPr>
-          <w:b/>
-          <w:bCs/>
-        </w:rPr>
-        <w:t xml:space="preserve">anunciado</w:t>
-      </w:r>
-      <w:r>
-        <w:t xml:space="preserve">: el clima se pronostica y la vulnerabilidad se conoce.</w:t>
-      </w:r>
-    </w:p>
-    <w:p>
-      <w:r>
-        <w:br w:type="page"/>
-      </w:r>
-    </w:p>
-    <w:bookmarkEnd w:id="16"/>
-    <w:bookmarkStart w:id="24" w:name="X0cf2b25fa38a48424544e6514685921bd9ac587"/>
-    <w:p>
-      <w:pPr>
-        <w:pStyle w:val="Heading1"/>
-      </w:pPr>
-      <w:r>
-        <w:t xml:space="preserve">Recomendaciones para la comunidad académica de la Facultad de Ciencias Sociales (UNA)</w:t>
-      </w:r>
-    </w:p>
-    <w:p>
-      <w:pPr>
-        <w:pStyle w:val="FirstParagraph"/>
-      </w:pPr>
-      <w:r>
-        <w:t xml:space="preserve">La</w:t>
-      </w:r>
-      <w:r>
-        <w:t xml:space="preserve"> </w:t>
-      </w:r>
-      <w:r>
-        <w:rPr>
-          <w:b/>
-          <w:bCs/>
-        </w:rPr>
         <w:t xml:space="preserve">Facultad de Ciencias Sociales (FACSO)</w:t>
       </w:r>
       <w:r>
@@ -894,7 +923,7 @@
         <w:t xml:space="preserve">extensión). El enfoque es doble —reactivo y proactivo—.</w:t>
       </w:r>
     </w:p>
-    <w:bookmarkStart w:id="17" w:name="continuidad-de-las-clases"/>
+    <w:bookmarkStart w:id="16" w:name="continuidad-de-las-clases"/>
     <w:p>
       <w:pPr>
         <w:pStyle w:val="Heading2"/>
@@ -1071,8 +1100,8 @@
         <w:t xml:space="preserve">intermitente) que no penalice a quien fue afectado por el evento.</w:t>
       </w:r>
     </w:p>
-    <w:bookmarkEnd w:id="17"/>
-    <w:bookmarkStart w:id="18" w:name="Xc1acf40fc4ded803b55e99d00e92c1fb96bdd4c"/>
+    <w:bookmarkEnd w:id="16"/>
+    <w:bookmarkStart w:id="17" w:name="Xc1acf40fc4ded803b55e99d00e92c1fb96bdd4c"/>
     <w:p>
       <w:pPr>
         <w:pStyle w:val="Heading2"/>
@@ -1169,8 +1198,8 @@
         <w:t xml:space="preserve">, con enfoque de género y territorio.</w:t>
       </w:r>
     </w:p>
-    <w:bookmarkEnd w:id="18"/>
-    <w:bookmarkStart w:id="19" w:name="investigación"/>
+    <w:bookmarkEnd w:id="17"/>
+    <w:bookmarkStart w:id="18" w:name="investigación"/>
     <w:p>
       <w:pPr>
         <w:pStyle w:val="Heading2"/>
@@ -1306,8 +1335,8 @@
         <w:t xml:space="preserve">comunidades ribereñas afectadas.</w:t>
       </w:r>
     </w:p>
-    <w:bookmarkEnd w:id="19"/>
-    <w:bookmarkStart w:id="20" w:name="extensión-y-vínculo-con-el-territorio"/>
+    <w:bookmarkEnd w:id="18"/>
+    <w:bookmarkStart w:id="19" w:name="extensión-y-vínculo-con-el-territorio"/>
     <w:p>
       <w:pPr>
         <w:pStyle w:val="Heading2"/>
@@ -1412,8 +1441,8 @@
         <w:t xml:space="preserve">desde la facultad.</w:t>
       </w:r>
     </w:p>
-    <w:bookmarkEnd w:id="20"/>
-    <w:bookmarkStart w:id="21" w:name="X56a6e0b8c17c37d3291b080ef293b07f08ad0ca"/>
+    <w:bookmarkEnd w:id="19"/>
+    <w:bookmarkStart w:id="20" w:name="X56a6e0b8c17c37d3291b080ef293b07f08ad0ca"/>
     <w:p>
       <w:pPr>
         <w:pStyle w:val="Heading2"/>
@@ -1554,8 +1583,8 @@
         <w:t xml:space="preserve">evacuación señalizadas.</w:t>
       </w:r>
     </w:p>
-    <w:bookmarkEnd w:id="21"/>
-    <w:bookmarkStart w:id="22" w:name="cronograma-sugerido"/>
+    <w:bookmarkEnd w:id="20"/>
+    <w:bookmarkStart w:id="21" w:name="cronograma-sugerido"/>
     <w:p>
       <w:pPr>
         <w:pStyle w:val="Heading2"/>
@@ -1705,75 +1734,75 @@
         </w:tc>
       </w:tr>
     </w:tbl>
+    <w:bookmarkEnd w:id="21"/>
+    <w:bookmarkStart w:id="22" w:name="conclusión"/>
+    <w:p>
+      <w:pPr>
+        <w:pStyle w:val="Heading2"/>
+      </w:pPr>
+      <w:r>
+        <w:t xml:space="preserve">Conclusión</w:t>
+      </w:r>
+    </w:p>
+    <w:p>
+      <w:pPr>
+        <w:pStyle w:val="FirstParagraph"/>
+      </w:pPr>
+      <w:r>
+        <w:t xml:space="preserve">La FACSO tiene una oportunidad única:</w:t>
+      </w:r>
+      <w:r>
+        <w:t xml:space="preserve"> </w:t>
+      </w:r>
+      <w:r>
+        <w:rPr>
+          <w:b/>
+          <w:bCs/>
+        </w:rPr>
+        <w:t xml:space="preserve">su objeto de estudio es, justamente, el riesgo</w:t>
+      </w:r>
+      <w:r>
+        <w:rPr>
+          <w:b/>
+          <w:bCs/>
+        </w:rPr>
+        <w:t xml:space="preserve"> </w:t>
+      </w:r>
+      <w:r>
+        <w:rPr>
+          <w:b/>
+          <w:bCs/>
+        </w:rPr>
+        <w:t xml:space="preserve">socialmente construido</w:t>
+      </w:r>
+      <w:r>
+        <w:t xml:space="preserve">. Anticiparse protege sus clases y, a la vez, la posiciona como</w:t>
+      </w:r>
+      <w:r>
+        <w:t xml:space="preserve"> </w:t>
+      </w:r>
+      <w:r>
+        <w:rPr>
+          <w:b/>
+          <w:bCs/>
+        </w:rPr>
+        <w:t xml:space="preserve">referente</w:t>
+      </w:r>
+      <w:r>
+        <w:t xml:space="preserve"> </w:t>
+      </w:r>
+      <w:r>
+        <w:t xml:space="preserve">en la comprensión y la reducción del desastre anunciado. Actuar sobre lo</w:t>
+      </w:r>
+      <w:r>
+        <w:t xml:space="preserve"> </w:t>
+      </w:r>
+      <w:r>
+        <w:t xml:space="preserve">previsible es más barato y más justo que responder tras el daño.</w:t>
+      </w:r>
+    </w:p>
     <w:bookmarkEnd w:id="22"/>
-    <w:bookmarkStart w:id="23" w:name="conclusión"/>
-    <w:p>
-      <w:pPr>
-        <w:pStyle w:val="Heading2"/>
-      </w:pPr>
-      <w:r>
-        <w:t xml:space="preserve">Conclusión</w:t>
-      </w:r>
-    </w:p>
-    <w:p>
-      <w:pPr>
-        <w:pStyle w:val="FirstParagraph"/>
-      </w:pPr>
-      <w:r>
-        <w:t xml:space="preserve">La FACSO tiene una oportunidad única:</w:t>
-      </w:r>
-      <w:r>
-        <w:t xml:space="preserve"> </w:t>
-      </w:r>
-      <w:r>
-        <w:rPr>
-          <w:b/>
-          <w:bCs/>
-        </w:rPr>
-        <w:t xml:space="preserve">su objeto de estudio es, justamente, el riesgo</w:t>
-      </w:r>
-      <w:r>
-        <w:rPr>
-          <w:b/>
-          <w:bCs/>
-        </w:rPr>
-        <w:t xml:space="preserve"> </w:t>
-      </w:r>
-      <w:r>
-        <w:rPr>
-          <w:b/>
-          <w:bCs/>
-        </w:rPr>
-        <w:t xml:space="preserve">socialmente construido</w:t>
-      </w:r>
-      <w:r>
-        <w:t xml:space="preserve">. Anticiparse protege sus clases y, a la vez, la posiciona como</w:t>
-      </w:r>
-      <w:r>
-        <w:t xml:space="preserve"> </w:t>
-      </w:r>
-      <w:r>
-        <w:rPr>
-          <w:b/>
-          <w:bCs/>
-        </w:rPr>
-        <w:t xml:space="preserve">referente</w:t>
-      </w:r>
-      <w:r>
-        <w:t xml:space="preserve"> </w:t>
-      </w:r>
-      <w:r>
-        <w:t xml:space="preserve">en la comprensión y la reducción del desastre anunciado. Actuar sobre lo</w:t>
-      </w:r>
-      <w:r>
-        <w:t xml:space="preserve"> </w:t>
-      </w:r>
-      <w:r>
-        <w:t xml:space="preserve">previsible es más barato y más justo que responder tras el daño.</w:t>
-      </w:r>
-    </w:p>
     <w:bookmarkEnd w:id="23"/>
-    <w:bookmarkEnd w:id="24"/>
     <w:bookmarkStart w:id="27" w:name="fuentes"/>
     <w:p>
       <w:pPr>
@@ -1994,7 +2023,7 @@
       <w:r>
         <w:t xml:space="preserve"> </w:t>
       </w:r>
-      <w:hyperlink r:id="rId14">
+      <w:hyperlink r:id="rId24">
         <w:r>
           <w:rPr>
             <w:rStyle w:val="Hyperlink"/>
@@ -2029,7 +2058,7 @@
       <w:r>
         <w:t xml:space="preserve"> </w:t>
       </w:r>
-      <w:hyperlink r:id="rId15">
+      <w:hyperlink r:id="rId14">
         <w:r>
           <w:rPr>
             <w:rStyle w:val="Hyperlink"/>

</xml_diff>

<commit_message>
Añade protocolos de actuación al informe FACSO (Gran Asunción)
Nueva sección "Protocolos de actuación" con 5 protocolos accionables (disparador +
pasos): (1) alerta meteorológica y decisión sobre clases; (2) durante un temporal/
raudal (seguridad en campus); (3) continuidad pedagógica no presencial; (4) prevención
de dengue en el predio; (5) estudiantes en zonas de riesgo. Anclados a los avisos
DINAC/SEN y a la evidencia del sitio (raudales 10-40 cm a 1-3 m/s).

Co-Authored-By: Claude Opus 4.8 <noreply@anthropic.com>
</commit_message>
<xml_diff>
--- a/informes/informe-elnino-facso-una.docx
+++ b/informes/informe-elnino-facso-una.docx
@@ -810,7 +810,7 @@
       </w:r>
     </w:p>
     <w:bookmarkEnd w:id="15"/>
-    <w:bookmarkStart w:id="23" w:name="X0cf2b25fa38a48424544e6514685921bd9ac587"/>
+    <w:bookmarkStart w:id="22" w:name="X0cf2b25fa38a48424544e6514685921bd9ac587"/>
     <w:p>
       <w:pPr>
         <w:pStyle w:val="Heading1"/>
@@ -1734,14 +1734,81 @@
         </w:tc>
       </w:tr>
     </w:tbl>
+    <w:p>
+      <w:r>
+        <w:br w:type="page"/>
+      </w:r>
+    </w:p>
     <w:bookmarkEnd w:id="21"/>
-    <w:bookmarkStart w:id="22" w:name="conclusión"/>
+    <w:bookmarkEnd w:id="22"/>
+    <w:bookmarkStart w:id="28" w:name="protocolos-de-actuación-gran-asunción"/>
+    <w:p>
+      <w:pPr>
+        <w:pStyle w:val="Heading1"/>
+      </w:pPr>
+      <w:r>
+        <w:t xml:space="preserve">Protocolos de actuación (Gran Asunción)</w:t>
+      </w:r>
+    </w:p>
+    <w:p>
+      <w:pPr>
+        <w:pStyle w:val="FirstParagraph"/>
+      </w:pPr>
+      <w:r>
+        <w:t xml:space="preserve">Pautas concretas y accionables. Cada protocolo indica el</w:t>
+      </w:r>
+      <w:r>
+        <w:t xml:space="preserve"> </w:t>
+      </w:r>
+      <w:r>
+        <w:rPr>
+          <w:b/>
+          <w:bCs/>
+        </w:rPr>
+        <w:t xml:space="preserve">disparador</w:t>
+      </w:r>
+      <w:r>
+        <w:t xml:space="preserve"> </w:t>
+      </w:r>
+      <w:r>
+        <w:t xml:space="preserve">(cuándo se</w:t>
+      </w:r>
+      <w:r>
+        <w:t xml:space="preserve"> </w:t>
+      </w:r>
+      <w:r>
+        <w:t xml:space="preserve">activa) y los</w:t>
+      </w:r>
+      <w:r>
+        <w:t xml:space="preserve"> </w:t>
+      </w:r>
+      <w:r>
+        <w:rPr>
+          <w:b/>
+          <w:bCs/>
+        </w:rPr>
+        <w:t xml:space="preserve">pasos</w:t>
+      </w:r>
+      <w:r>
+        <w:t xml:space="preserve"> </w:t>
+      </w:r>
+      <w:r>
+        <w:t xml:space="preserve">a seguir. Los umbrales se apoyan en los avisos de la DINAC/SEN y</w:t>
+      </w:r>
+      <w:r>
+        <w:t xml:space="preserve"> </w:t>
+      </w:r>
+      <w:r>
+        <w:t xml:space="preserve">en la evidencia del proyecto.</w:t>
+      </w:r>
+    </w:p>
+    <w:bookmarkStart w:id="23" w:name="X7680b6ca5cc7a69520acaf791206cbd100b17b1"/>
     <w:p>
       <w:pPr>
         <w:pStyle w:val="Heading2"/>
       </w:pPr>
       <w:r>
-        <w:t xml:space="preserve">Conclusión</w:t>
+        <w:t xml:space="preserve">Protocolo 1 · Alerta meteorológica y decisión sobre las clases</w:t>
       </w:r>
     </w:p>
     <w:p>
@@ -1749,67 +1816,23 @@
         <w:pStyle w:val="FirstParagraph"/>
       </w:pPr>
       <w:r>
-        <w:t xml:space="preserve">La FACSO tiene una oportunidad única:</w:t>
-      </w:r>
-      <w:r>
-        <w:t xml:space="preserve"> </w:t>
-      </w:r>
-      <w:r>
-        <w:rPr>
-          <w:b/>
-          <w:bCs/>
-        </w:rPr>
-        <w:t xml:space="preserve">su objeto de estudio es, justamente, el riesgo</w:t>
-      </w:r>
-      <w:r>
-        <w:rPr>
-          <w:b/>
-          <w:bCs/>
-        </w:rPr>
-        <w:t xml:space="preserve"> </w:t>
-      </w:r>
-      <w:r>
-        <w:rPr>
-          <w:b/>
-          <w:bCs/>
-        </w:rPr>
-        <w:t xml:space="preserve">socialmente construido</w:t>
-      </w:r>
-      <w:r>
-        <w:t xml:space="preserve">. Anticiparse protege sus clases y, a la vez, la posiciona como</w:t>
-      </w:r>
-      <w:r>
-        <w:t xml:space="preserve"> </w:t>
-      </w:r>
-      <w:r>
-        <w:rPr>
-          <w:b/>
-          <w:bCs/>
-        </w:rPr>
-        <w:t xml:space="preserve">referente</w:t>
-      </w:r>
-      <w:r>
-        <w:t xml:space="preserve"> </w:t>
-      </w:r>
-      <w:r>
-        <w:t xml:space="preserve">en la comprensión y la reducción del desastre anunciado. Actuar sobre lo</w:t>
-      </w:r>
-      <w:r>
-        <w:t xml:space="preserve"> </w:t>
-      </w:r>
-      <w:r>
-        <w:t xml:space="preserve">previsible es más barato y más justo que responder tras el daño.</w:t>
-      </w:r>
-    </w:p>
-    <w:bookmarkEnd w:id="22"/>
-    <w:bookmarkEnd w:id="23"/>
-    <w:bookmarkStart w:id="27" w:name="fuentes"/>
-    <w:p>
-      <w:pPr>
-        <w:pStyle w:val="Heading1"/>
-      </w:pPr>
-      <w:r>
-        <w:t xml:space="preserve">Fuentes</w:t>
+        <w:rPr>
+          <w:b/>
+          <w:bCs/>
+        </w:rPr>
+        <w:t xml:space="preserve">Disparador:</w:t>
+      </w:r>
+      <w:r>
+        <w:t xml:space="preserve"> </w:t>
+      </w:r>
+      <w:r>
+        <w:t xml:space="preserve">aviso de temporal o lluvia intensa de la DINAC/SEN para el Gran</w:t>
+      </w:r>
+      <w:r>
+        <w:t xml:space="preserve"> </w:t>
+      </w:r>
+      <w:r>
+        <w:t xml:space="preserve">Asunción, o ascenso del río hacia niveles de alerta.</w:t>
       </w:r>
     </w:p>
     <w:p>
@@ -1818,6 +1841,717 @@
         <w:numPr>
           <w:ilvl w:val="0"/>
           <w:numId w:val="1006"/>
+        </w:numPr>
+      </w:pPr>
+      <w:r>
+        <w:t xml:space="preserve">Un</w:t>
+      </w:r>
+      <w:r>
+        <w:t xml:space="preserve"> </w:t>
+      </w:r>
+      <w:r>
+        <w:rPr>
+          <w:b/>
+          <w:bCs/>
+        </w:rPr>
+        <w:t xml:space="preserve">referente académico designado</w:t>
+      </w:r>
+      <w:r>
+        <w:t xml:space="preserve"> </w:t>
+      </w:r>
+      <w:r>
+        <w:t xml:space="preserve">(p. ej. Secretaría Académica) monitorea a diario</w:t>
+      </w:r>
+      <w:r>
+        <w:t xml:space="preserve"> </w:t>
+      </w:r>
+      <w:r>
+        <w:t xml:space="preserve">los avisos de la</w:t>
+      </w:r>
+      <w:r>
+        <w:t xml:space="preserve"> </w:t>
+      </w:r>
+      <w:r>
+        <w:rPr>
+          <w:b/>
+          <w:bCs/>
+        </w:rPr>
+        <w:t xml:space="preserve">DINAC/SEN</w:t>
+      </w:r>
+      <w:r>
+        <w:t xml:space="preserve"> </w:t>
+      </w:r>
+      <w:r>
+        <w:t xml:space="preserve">y el nivel del río.</w:t>
+      </w:r>
+    </w:p>
+    <w:p>
+      <w:pPr>
+        <w:pStyle w:val="Compact"/>
+        <w:numPr>
+          <w:ilvl w:val="0"/>
+          <w:numId w:val="1006"/>
+        </w:numPr>
+      </w:pPr>
+      <w:r>
+        <w:t xml:space="preserve">Ante un</w:t>
+      </w:r>
+      <w:r>
+        <w:t xml:space="preserve"> </w:t>
+      </w:r>
+      <w:r>
+        <w:rPr>
+          <w:b/>
+          <w:bCs/>
+        </w:rPr>
+        <w:t xml:space="preserve">aviso naranja o rojo</w:t>
+      </w:r>
+      <w:r>
+        <w:t xml:space="preserve"> </w:t>
+      </w:r>
+      <w:r>
+        <w:t xml:space="preserve">o pronóstico de temporal severo, se aplica el criterio</w:t>
+      </w:r>
+      <w:r>
+        <w:t xml:space="preserve"> </w:t>
+      </w:r>
+      <w:r>
+        <w:t xml:space="preserve">predefinido y se decide entre:</w:t>
+      </w:r>
+      <w:r>
+        <w:t xml:space="preserve"> </w:t>
+      </w:r>
+      <w:r>
+        <w:rPr>
+          <w:b/>
+          <w:bCs/>
+        </w:rPr>
+        <w:t xml:space="preserve">presencial · virtual · suspensión con recuperación</w:t>
+      </w:r>
+      <w:r>
+        <w:t xml:space="preserve">.</w:t>
+      </w:r>
+    </w:p>
+    <w:p>
+      <w:pPr>
+        <w:pStyle w:val="Compact"/>
+        <w:numPr>
+          <w:ilvl w:val="0"/>
+          <w:numId w:val="1006"/>
+        </w:numPr>
+      </w:pPr>
+      <w:r>
+        <w:rPr>
+          <w:b/>
+          <w:bCs/>
+        </w:rPr>
+        <w:t xml:space="preserve">Comunicar la decisión con la mayor antelación posible</w:t>
+      </w:r>
+      <w:r>
+        <w:t xml:space="preserve"> </w:t>
+      </w:r>
+      <w:r>
+        <w:t xml:space="preserve">(idealmente la tarde</w:t>
+      </w:r>
+      <w:r>
+        <w:t xml:space="preserve"> </w:t>
+      </w:r>
+      <w:r>
+        <w:t xml:space="preserve">anterior) por los canales oficiales: aula virtual, correo institucional y redes.</w:t>
+      </w:r>
+    </w:p>
+    <w:p>
+      <w:pPr>
+        <w:pStyle w:val="Compact"/>
+        <w:numPr>
+          <w:ilvl w:val="0"/>
+          <w:numId w:val="1006"/>
+        </w:numPr>
+      </w:pPr>
+      <w:r>
+        <w:t xml:space="preserve">Si se pasa a virtual, activar el</w:t>
+      </w:r>
+      <w:r>
+        <w:t xml:space="preserve"> </w:t>
+      </w:r>
+      <w:r>
+        <w:rPr>
+          <w:b/>
+          <w:bCs/>
+        </w:rPr>
+        <w:t xml:space="preserve">Protocolo 3</w:t>
+      </w:r>
+      <w:r>
+        <w:t xml:space="preserve">.</w:t>
+      </w:r>
+    </w:p>
+    <w:bookmarkEnd w:id="23"/>
+    <w:bookmarkStart w:id="24" w:name="Xd2beb73e712729830cc9f84d79101b618df77ab"/>
+    <w:p>
+      <w:pPr>
+        <w:pStyle w:val="Heading2"/>
+      </w:pPr>
+      <w:r>
+        <w:t xml:space="preserve">Protocolo 2 · Durante un temporal o raudal (seguridad en el campus)</w:t>
+      </w:r>
+    </w:p>
+    <w:p>
+      <w:pPr>
+        <w:pStyle w:val="FirstParagraph"/>
+      </w:pPr>
+      <w:r>
+        <w:rPr>
+          <w:b/>
+          <w:bCs/>
+        </w:rPr>
+        <w:t xml:space="preserve">Disparador:</w:t>
+      </w:r>
+      <w:r>
+        <w:t xml:space="preserve"> </w:t>
+      </w:r>
+      <w:r>
+        <w:t xml:space="preserve">temporal en curso durante la jornada.</w:t>
+      </w:r>
+    </w:p>
+    <w:p>
+      <w:pPr>
+        <w:pStyle w:val="Compact"/>
+        <w:numPr>
+          <w:ilvl w:val="0"/>
+          <w:numId w:val="1007"/>
+        </w:numPr>
+      </w:pPr>
+      <w:r>
+        <w:rPr>
+          <w:b/>
+          <w:bCs/>
+        </w:rPr>
+        <w:t xml:space="preserve">Resguardarse</w:t>
+      </w:r>
+      <w:r>
+        <w:t xml:space="preserve"> </w:t>
+      </w:r>
+      <w:r>
+        <w:t xml:space="preserve">en lugares techados y seguros;</w:t>
+      </w:r>
+      <w:r>
+        <w:t xml:space="preserve"> </w:t>
+      </w:r>
+      <w:r>
+        <w:rPr>
+          <w:b/>
+          <w:bCs/>
+        </w:rPr>
+        <w:t xml:space="preserve">no circular por zonas anegadas</w:t>
+      </w:r>
+      <w:r>
+        <w:t xml:space="preserve"> </w:t>
+      </w:r>
+      <w:r>
+        <w:t xml:space="preserve">ni</w:t>
+      </w:r>
+      <w:r>
+        <w:t xml:space="preserve"> </w:t>
+      </w:r>
+      <w:r>
+        <w:t xml:space="preserve">cruzar raudales —láminas de</w:t>
+      </w:r>
+      <w:r>
+        <w:t xml:space="preserve"> </w:t>
+      </w:r>
+      <w:r>
+        <w:rPr>
+          <w:b/>
+          <w:bCs/>
+        </w:rPr>
+        <w:t xml:space="preserve">10–40 cm a 1–3 m/s ya arrastran personas y vehículos</w:t>
+      </w:r>
+      <w:r>
+        <w:t xml:space="preserve">—.</w:t>
+      </w:r>
+    </w:p>
+    <w:p>
+      <w:pPr>
+        <w:pStyle w:val="Compact"/>
+        <w:numPr>
+          <w:ilvl w:val="0"/>
+          <w:numId w:val="1007"/>
+        </w:numPr>
+      </w:pPr>
+      <w:r>
+        <w:t xml:space="preserve">Cortar la energía en sectores inundados; alejarse de tendidos eléctricos caídos.</w:t>
+      </w:r>
+    </w:p>
+    <w:p>
+      <w:pPr>
+        <w:pStyle w:val="Compact"/>
+        <w:numPr>
+          <w:ilvl w:val="0"/>
+          <w:numId w:val="1007"/>
+        </w:numPr>
+      </w:pPr>
+      <w:r>
+        <w:t xml:space="preserve">Al amainar, disponer una</w:t>
+      </w:r>
+      <w:r>
+        <w:t xml:space="preserve"> </w:t>
+      </w:r>
+      <w:r>
+        <w:rPr>
+          <w:b/>
+          <w:bCs/>
+        </w:rPr>
+        <w:t xml:space="preserve">salida ordenada</w:t>
+      </w:r>
+      <w:r>
+        <w:t xml:space="preserve">; evitar avenidas y arroyos desbordados del</w:t>
+      </w:r>
+      <w:r>
+        <w:t xml:space="preserve"> </w:t>
+      </w:r>
+      <w:r>
+        <w:t xml:space="preserve">entorno.</w:t>
+      </w:r>
+    </w:p>
+    <w:p>
+      <w:pPr>
+        <w:pStyle w:val="Compact"/>
+        <w:numPr>
+          <w:ilvl w:val="0"/>
+          <w:numId w:val="1007"/>
+        </w:numPr>
+      </w:pPr>
+      <w:r>
+        <w:t xml:space="preserve">Reportar novedades a la coordinación y</w:t>
+      </w:r>
+      <w:r>
+        <w:t xml:space="preserve"> </w:t>
+      </w:r>
+      <w:r>
+        <w:rPr>
+          <w:b/>
+          <w:bCs/>
+        </w:rPr>
+        <w:t xml:space="preserve">registrar la interrupción</w:t>
+      </w:r>
+      <w:r>
+        <w:t xml:space="preserve">.</w:t>
+      </w:r>
+    </w:p>
+    <w:bookmarkEnd w:id="24"/>
+    <w:bookmarkStart w:id="25" w:name="Xf69fe133cde78f24d381e05557c0392c12ef179"/>
+    <w:p>
+      <w:pPr>
+        <w:pStyle w:val="Heading2"/>
+      </w:pPr>
+      <w:r>
+        <w:t xml:space="preserve">Protocolo 3 · Continuidad pedagógica (jornada no presencial)</w:t>
+      </w:r>
+    </w:p>
+    <w:p>
+      <w:pPr>
+        <w:pStyle w:val="Compact"/>
+        <w:numPr>
+          <w:ilvl w:val="0"/>
+          <w:numId w:val="1008"/>
+        </w:numPr>
+      </w:pPr>
+      <w:r>
+        <w:t xml:space="preserve">Cada docente deja disponible ese día</w:t>
+      </w:r>
+      <w:r>
+        <w:t xml:space="preserve"> </w:t>
+      </w:r>
+      <w:r>
+        <w:rPr>
+          <w:b/>
+          <w:bCs/>
+        </w:rPr>
+        <w:t xml:space="preserve">material o clase asincrónica</w:t>
+      </w:r>
+      <w:r>
+        <w:t xml:space="preserve"> </w:t>
+      </w:r>
+      <w:r>
+        <w:t xml:space="preserve">(lectura guiada,</w:t>
+      </w:r>
+      <w:r>
+        <w:t xml:space="preserve"> </w:t>
+      </w:r>
+      <w:r>
+        <w:t xml:space="preserve">grabación, foro o consigna) en el aula virtual.</w:t>
+      </w:r>
+    </w:p>
+    <w:p>
+      <w:pPr>
+        <w:pStyle w:val="Compact"/>
+        <w:numPr>
+          <w:ilvl w:val="0"/>
+          <w:numId w:val="1008"/>
+        </w:numPr>
+      </w:pPr>
+      <w:r>
+        <w:rPr>
+          <w:b/>
+          <w:bCs/>
+        </w:rPr>
+        <w:t xml:space="preserve">Asistencia y entregas flexibles</w:t>
+      </w:r>
+      <w:r>
+        <w:t xml:space="preserve">: ventana ampliada, sin penalizar a quien fue</w:t>
+      </w:r>
+      <w:r>
+        <w:t xml:space="preserve"> </w:t>
+      </w:r>
+      <w:r>
+        <w:t xml:space="preserve">afectado por el evento.</w:t>
+      </w:r>
+    </w:p>
+    <w:p>
+      <w:pPr>
+        <w:pStyle w:val="Compact"/>
+        <w:numPr>
+          <w:ilvl w:val="0"/>
+          <w:numId w:val="1008"/>
+        </w:numPr>
+      </w:pPr>
+      <w:r>
+        <w:t xml:space="preserve">Habilitar</w:t>
+      </w:r>
+      <w:r>
+        <w:t xml:space="preserve"> </w:t>
+      </w:r>
+      <w:r>
+        <w:rPr>
+          <w:b/>
+          <w:bCs/>
+        </w:rPr>
+        <w:t xml:space="preserve">soporte para estudiantes sin conectividad</w:t>
+      </w:r>
+      <w:r>
+        <w:t xml:space="preserve"> </w:t>
+      </w:r>
+      <w:r>
+        <w:t xml:space="preserve">(reprogramación, materiales</w:t>
+      </w:r>
+      <w:r>
+        <w:t xml:space="preserve"> </w:t>
+      </w:r>
+      <w:r>
+        <w:t xml:space="preserve">descargables).</w:t>
+      </w:r>
+    </w:p>
+    <w:p>
+      <w:pPr>
+        <w:pStyle w:val="Compact"/>
+        <w:numPr>
+          <w:ilvl w:val="0"/>
+          <w:numId w:val="1008"/>
+        </w:numPr>
+      </w:pPr>
+      <w:r>
+        <w:rPr>
+          <w:b/>
+          <w:bCs/>
+        </w:rPr>
+        <w:t xml:space="preserve">Registrar la actividad</w:t>
+      </w:r>
+      <w:r>
+        <w:t xml:space="preserve"> </w:t>
+      </w:r>
+      <w:r>
+        <w:t xml:space="preserve">para su reconocimiento y la posterior recuperación.</w:t>
+      </w:r>
+    </w:p>
+    <w:bookmarkEnd w:id="25"/>
+    <w:bookmarkStart w:id="26" w:name="Xd8f1bbc2ea9b0d41dde86d31c7bf5ac7a662532"/>
+    <w:p>
+      <w:pPr>
+        <w:pStyle w:val="Heading2"/>
+      </w:pPr>
+      <w:r>
+        <w:t xml:space="preserve">Protocolo 4 · Prevención de dengue en el predio</w:t>
+      </w:r>
+    </w:p>
+    <w:p>
+      <w:pPr>
+        <w:pStyle w:val="Compact"/>
+        <w:numPr>
+          <w:ilvl w:val="0"/>
+          <w:numId w:val="1009"/>
+        </w:numPr>
+      </w:pPr>
+      <w:r>
+        <w:rPr>
+          <w:b/>
+          <w:bCs/>
+        </w:rPr>
+        <w:t xml:space="preserve">Recorridas semanales</w:t>
+      </w:r>
+      <w:r>
+        <w:t xml:space="preserve"> </w:t>
+      </w:r>
+      <w:r>
+        <w:t xml:space="preserve">de eliminación de criaderos (recipientes, cubiertas, agua</w:t>
+      </w:r>
+      <w:r>
+        <w:t xml:space="preserve"> </w:t>
+      </w:r>
+      <w:r>
+        <w:t xml:space="preserve">estancada), antes y durante la temporada de lluvias.</w:t>
+      </w:r>
+    </w:p>
+    <w:p>
+      <w:pPr>
+        <w:pStyle w:val="Compact"/>
+        <w:numPr>
+          <w:ilvl w:val="0"/>
+          <w:numId w:val="1009"/>
+        </w:numPr>
+      </w:pPr>
+      <w:r>
+        <w:t xml:space="preserve">Mantener el predio sin acumulación de agua;</w:t>
+      </w:r>
+      <w:r>
+        <w:t xml:space="preserve"> </w:t>
+      </w:r>
+      <w:r>
+        <w:rPr>
+          <w:b/>
+          <w:bCs/>
+        </w:rPr>
+        <w:t xml:space="preserve">mingas ambientales</w:t>
+      </w:r>
+      <w:r>
+        <w:t xml:space="preserve"> </w:t>
+      </w:r>
+      <w:r>
+        <w:t xml:space="preserve">periódicas.</w:t>
+      </w:r>
+    </w:p>
+    <w:p>
+      <w:pPr>
+        <w:pStyle w:val="Compact"/>
+        <w:numPr>
+          <w:ilvl w:val="0"/>
+          <w:numId w:val="1009"/>
+        </w:numPr>
+      </w:pPr>
+      <w:r>
+        <w:t xml:space="preserve">Ante un</w:t>
+      </w:r>
+      <w:r>
+        <w:t xml:space="preserve"> </w:t>
+      </w:r>
+      <w:r>
+        <w:rPr>
+          <w:b/>
+          <w:bCs/>
+        </w:rPr>
+        <w:t xml:space="preserve">caso sospechoso</w:t>
+      </w:r>
+      <w:r>
+        <w:t xml:space="preserve"> </w:t>
+      </w:r>
+      <w:r>
+        <w:t xml:space="preserve">en la comunidad, derivar al sistema de salud y notificar</w:t>
+      </w:r>
+      <w:r>
+        <w:t xml:space="preserve"> </w:t>
+      </w:r>
+      <w:r>
+        <w:t xml:space="preserve">según el protocolo del MSPBS.</w:t>
+      </w:r>
+    </w:p>
+    <w:bookmarkEnd w:id="26"/>
+    <w:bookmarkStart w:id="27" w:name="Xfdf2a8c33d23ea35aa7e361d8f91e522bb305fc"/>
+    <w:p>
+      <w:pPr>
+        <w:pStyle w:val="Heading2"/>
+      </w:pPr>
+      <w:r>
+        <w:t xml:space="preserve">Protocolo 5 · Estudiantes en zonas de riesgo (bañados / crecida del río)</w:t>
+      </w:r>
+    </w:p>
+    <w:p>
+      <w:pPr>
+        <w:pStyle w:val="Compact"/>
+        <w:numPr>
+          <w:ilvl w:val="0"/>
+          <w:numId w:val="1010"/>
+        </w:numPr>
+      </w:pPr>
+      <w:r>
+        <w:rPr>
+          <w:b/>
+          <w:bCs/>
+        </w:rPr>
+        <w:t xml:space="preserve">Relevar</w:t>
+      </w:r>
+      <w:r>
+        <w:t xml:space="preserve"> </w:t>
+      </w:r>
+      <w:r>
+        <w:t xml:space="preserve">al inicio del semestre quiénes viven en zonas inundables o dependen de</w:t>
+      </w:r>
+      <w:r>
+        <w:t xml:space="preserve"> </w:t>
+      </w:r>
+      <w:r>
+        <w:t xml:space="preserve">transporte vulnerable.</w:t>
+      </w:r>
+    </w:p>
+    <w:p>
+      <w:pPr>
+        <w:pStyle w:val="Compact"/>
+        <w:numPr>
+          <w:ilvl w:val="0"/>
+          <w:numId w:val="1010"/>
+        </w:numPr>
+      </w:pPr>
+      <w:r>
+        <w:t xml:space="preserve">Habilitar un</w:t>
+      </w:r>
+      <w:r>
+        <w:t xml:space="preserve"> </w:t>
+      </w:r>
+      <w:r>
+        <w:rPr>
+          <w:b/>
+          <w:bCs/>
+        </w:rPr>
+        <w:t xml:space="preserve">canal de aviso de inasistencia justificada</w:t>
+      </w:r>
+      <w:r>
+        <w:t xml:space="preserve"> </w:t>
+      </w:r>
+      <w:r>
+        <w:t xml:space="preserve">por la emergencia.</w:t>
+      </w:r>
+    </w:p>
+    <w:p>
+      <w:pPr>
+        <w:pStyle w:val="Compact"/>
+        <w:numPr>
+          <w:ilvl w:val="0"/>
+          <w:numId w:val="1010"/>
+        </w:numPr>
+      </w:pPr>
+      <w:r>
+        <w:t xml:space="preserve">Aplicar</w:t>
+      </w:r>
+      <w:r>
+        <w:t xml:space="preserve"> </w:t>
+      </w:r>
+      <w:r>
+        <w:rPr>
+          <w:b/>
+          <w:bCs/>
+        </w:rPr>
+        <w:t xml:space="preserve">flexibilidad académica</w:t>
+      </w:r>
+      <w:r>
+        <w:t xml:space="preserve"> </w:t>
+      </w:r>
+      <w:r>
+        <w:t xml:space="preserve">y derivar a Bienestar Estudiantil / extensión para</w:t>
+      </w:r>
+      <w:r>
+        <w:t xml:space="preserve"> </w:t>
+      </w:r>
+      <w:r>
+        <w:t xml:space="preserve">el acompañamiento.</w:t>
+      </w:r>
+    </w:p>
+    <w:p>
+      <w:r>
+        <w:br w:type="page"/>
+      </w:r>
+    </w:p>
+    <w:bookmarkEnd w:id="27"/>
+    <w:bookmarkEnd w:id="28"/>
+    <w:bookmarkStart w:id="29" w:name="conclusión"/>
+    <w:p>
+      <w:pPr>
+        <w:pStyle w:val="Heading1"/>
+      </w:pPr>
+      <w:r>
+        <w:t xml:space="preserve">Conclusión</w:t>
+      </w:r>
+    </w:p>
+    <w:p>
+      <w:pPr>
+        <w:pStyle w:val="FirstParagraph"/>
+      </w:pPr>
+      <w:r>
+        <w:t xml:space="preserve">La FACSO tiene una oportunidad única:</w:t>
+      </w:r>
+      <w:r>
+        <w:t xml:space="preserve"> </w:t>
+      </w:r>
+      <w:r>
+        <w:rPr>
+          <w:b/>
+          <w:bCs/>
+        </w:rPr>
+        <w:t xml:space="preserve">su objeto de estudio es, justamente, el riesgo</w:t>
+      </w:r>
+      <w:r>
+        <w:rPr>
+          <w:b/>
+          <w:bCs/>
+        </w:rPr>
+        <w:t xml:space="preserve"> </w:t>
+      </w:r>
+      <w:r>
+        <w:rPr>
+          <w:b/>
+          <w:bCs/>
+        </w:rPr>
+        <w:t xml:space="preserve">socialmente construido</w:t>
+      </w:r>
+      <w:r>
+        <w:t xml:space="preserve">. Anticiparse protege sus clases y, a la vez, la posiciona como</w:t>
+      </w:r>
+      <w:r>
+        <w:t xml:space="preserve"> </w:t>
+      </w:r>
+      <w:r>
+        <w:rPr>
+          <w:b/>
+          <w:bCs/>
+        </w:rPr>
+        <w:t xml:space="preserve">referente</w:t>
+      </w:r>
+      <w:r>
+        <w:t xml:space="preserve"> </w:t>
+      </w:r>
+      <w:r>
+        <w:t xml:space="preserve">en la comprensión y la reducción del desastre anunciado. Actuar sobre lo</w:t>
+      </w:r>
+      <w:r>
+        <w:t xml:space="preserve"> </w:t>
+      </w:r>
+      <w:r>
+        <w:t xml:space="preserve">previsible es más barato y más justo que responder tras el daño.</w:t>
+      </w:r>
+    </w:p>
+    <w:bookmarkEnd w:id="29"/>
+    <w:bookmarkStart w:id="33" w:name="fuentes"/>
+    <w:p>
+      <w:pPr>
+        <w:pStyle w:val="Heading1"/>
+      </w:pPr>
+      <w:r>
+        <w:t xml:space="preserve">Fuentes</w:t>
+      </w:r>
+    </w:p>
+    <w:p>
+      <w:pPr>
+        <w:pStyle w:val="Compact"/>
+        <w:numPr>
+          <w:ilvl w:val="0"/>
+          <w:numId w:val="1011"/>
         </w:numPr>
       </w:pPr>
       <w:r>
@@ -1856,7 +2590,7 @@
         <w:pStyle w:val="Compact"/>
         <w:numPr>
           <w:ilvl w:val="0"/>
-          <w:numId w:val="1006"/>
+          <w:numId w:val="1011"/>
         </w:numPr>
       </w:pPr>
       <w:r>
@@ -1892,7 +2626,7 @@
         <w:pStyle w:val="Compact"/>
         <w:numPr>
           <w:ilvl w:val="0"/>
-          <w:numId w:val="1006"/>
+          <w:numId w:val="1011"/>
         </w:numPr>
       </w:pPr>
       <w:r>
@@ -1927,7 +2661,7 @@
         <w:pStyle w:val="Compact"/>
         <w:numPr>
           <w:ilvl w:val="0"/>
-          <w:numId w:val="1006"/>
+          <w:numId w:val="1011"/>
         </w:numPr>
       </w:pPr>
       <w:r>
@@ -1963,7 +2697,7 @@
         <w:pStyle w:val="Compact"/>
         <w:numPr>
           <w:ilvl w:val="0"/>
-          <w:numId w:val="1006"/>
+          <w:numId w:val="1011"/>
         </w:numPr>
       </w:pPr>
       <w:r>
@@ -2002,7 +2736,7 @@
         <w:pStyle w:val="Compact"/>
         <w:numPr>
           <w:ilvl w:val="0"/>
-          <w:numId w:val="1006"/>
+          <w:numId w:val="1011"/>
         </w:numPr>
       </w:pPr>
       <w:r>
@@ -2023,7 +2757,7 @@
       <w:r>
         <w:t xml:space="preserve"> </w:t>
       </w:r>
-      <w:hyperlink r:id="rId24">
+      <w:hyperlink r:id="rId30">
         <w:r>
           <w:rPr>
             <w:rStyle w:val="Hyperlink"/>
@@ -2037,7 +2771,7 @@
         <w:pStyle w:val="Compact"/>
         <w:numPr>
           <w:ilvl w:val="0"/>
-          <w:numId w:val="1006"/>
+          <w:numId w:val="1011"/>
         </w:numPr>
       </w:pPr>
       <w:r>
@@ -2072,7 +2806,7 @@
         <w:pStyle w:val="Compact"/>
         <w:numPr>
           <w:ilvl w:val="0"/>
-          <w:numId w:val="1006"/>
+          <w:numId w:val="1011"/>
         </w:numPr>
       </w:pPr>
       <w:r>
@@ -2094,7 +2828,7 @@
       <w:r>
         <w:t xml:space="preserve"> </w:t>
       </w:r>
-      <w:hyperlink r:id="rId25">
+      <w:hyperlink r:id="rId31">
         <w:r>
           <w:rPr>
             <w:rStyle w:val="Hyperlink"/>
@@ -2108,7 +2842,7 @@
         <w:pStyle w:val="Compact"/>
         <w:numPr>
           <w:ilvl w:val="0"/>
-          <w:numId w:val="1006"/>
+          <w:numId w:val="1011"/>
         </w:numPr>
       </w:pPr>
       <w:r>
@@ -2130,7 +2864,7 @@
       <w:r>
         <w:t xml:space="preserve"> </w:t>
       </w:r>
-      <w:hyperlink r:id="rId26">
+      <w:hyperlink r:id="rId32">
         <w:r>
           <w:rPr>
             <w:rStyle w:val="Hyperlink"/>
@@ -2139,7 +2873,7 @@
         </w:r>
       </w:hyperlink>
     </w:p>
-    <w:bookmarkEnd w:id="27"/>
+    <w:bookmarkEnd w:id="33"/>
     <w:sectPr>
       <w:footnotePr>
         <w:numRestart w:val="eachSect"/>
@@ -2457,6 +3191,156 @@
     <w:abstractNumId w:val="991"/>
   </w:num>
   <w:num w:numId="1006">
+    <w:abstractNumId w:val="99411"/>
+    <w:lvlOverride w:ilvl="0">
+      <w:startOverride w:val="1"/>
+    </w:lvlOverride>
+    <w:lvlOverride w:ilvl="1">
+      <w:startOverride w:val="1"/>
+    </w:lvlOverride>
+    <w:lvlOverride w:ilvl="2">
+      <w:startOverride w:val="1"/>
+    </w:lvlOverride>
+    <w:lvlOverride w:ilvl="3">
+      <w:startOverride w:val="1"/>
+    </w:lvlOverride>
+    <w:lvlOverride w:ilvl="4">
+      <w:startOverride w:val="1"/>
+    </w:lvlOverride>
+    <w:lvlOverride w:ilvl="5">
+      <w:startOverride w:val="1"/>
+    </w:lvlOverride>
+    <w:lvlOverride w:ilvl="6">
+      <w:startOverride w:val="1"/>
+    </w:lvlOverride>
+    <w:lvlOverride w:ilvl="7">
+      <w:startOverride w:val="1"/>
+    </w:lvlOverride>
+    <w:lvlOverride w:ilvl="8">
+      <w:startOverride w:val="1"/>
+    </w:lvlOverride>
+  </w:num>
+  <w:num w:numId="1007">
+    <w:abstractNumId w:val="99411"/>
+    <w:lvlOverride w:ilvl="0">
+      <w:startOverride w:val="1"/>
+    </w:lvlOverride>
+    <w:lvlOverride w:ilvl="1">
+      <w:startOverride w:val="1"/>
+    </w:lvlOverride>
+    <w:lvlOverride w:ilvl="2">
+      <w:startOverride w:val="1"/>
+    </w:lvlOverride>
+    <w:lvlOverride w:ilvl="3">
+      <w:startOverride w:val="1"/>
+    </w:lvlOverride>
+    <w:lvlOverride w:ilvl="4">
+      <w:startOverride w:val="1"/>
+    </w:lvlOverride>
+    <w:lvlOverride w:ilvl="5">
+      <w:startOverride w:val="1"/>
+    </w:lvlOverride>
+    <w:lvlOverride w:ilvl="6">
+      <w:startOverride w:val="1"/>
+    </w:lvlOverride>
+    <w:lvlOverride w:ilvl="7">
+      <w:startOverride w:val="1"/>
+    </w:lvlOverride>
+    <w:lvlOverride w:ilvl="8">
+      <w:startOverride w:val="1"/>
+    </w:lvlOverride>
+  </w:num>
+  <w:num w:numId="1008">
+    <w:abstractNumId w:val="99411"/>
+    <w:lvlOverride w:ilvl="0">
+      <w:startOverride w:val="1"/>
+    </w:lvlOverride>
+    <w:lvlOverride w:ilvl="1">
+      <w:startOverride w:val="1"/>
+    </w:lvlOverride>
+    <w:lvlOverride w:ilvl="2">
+      <w:startOverride w:val="1"/>
+    </w:lvlOverride>
+    <w:lvlOverride w:ilvl="3">
+      <w:startOverride w:val="1"/>
+    </w:lvlOverride>
+    <w:lvlOverride w:ilvl="4">
+      <w:startOverride w:val="1"/>
+    </w:lvlOverride>
+    <w:lvlOverride w:ilvl="5">
+      <w:startOverride w:val="1"/>
+    </w:lvlOverride>
+    <w:lvlOverride w:ilvl="6">
+      <w:startOverride w:val="1"/>
+    </w:lvlOverride>
+    <w:lvlOverride w:ilvl="7">
+      <w:startOverride w:val="1"/>
+    </w:lvlOverride>
+    <w:lvlOverride w:ilvl="8">
+      <w:startOverride w:val="1"/>
+    </w:lvlOverride>
+  </w:num>
+  <w:num w:numId="1009">
+    <w:abstractNumId w:val="99411"/>
+    <w:lvlOverride w:ilvl="0">
+      <w:startOverride w:val="1"/>
+    </w:lvlOverride>
+    <w:lvlOverride w:ilvl="1">
+      <w:startOverride w:val="1"/>
+    </w:lvlOverride>
+    <w:lvlOverride w:ilvl="2">
+      <w:startOverride w:val="1"/>
+    </w:lvlOverride>
+    <w:lvlOverride w:ilvl="3">
+      <w:startOverride w:val="1"/>
+    </w:lvlOverride>
+    <w:lvlOverride w:ilvl="4">
+      <w:startOverride w:val="1"/>
+    </w:lvlOverride>
+    <w:lvlOverride w:ilvl="5">
+      <w:startOverride w:val="1"/>
+    </w:lvlOverride>
+    <w:lvlOverride w:ilvl="6">
+      <w:startOverride w:val="1"/>
+    </w:lvlOverride>
+    <w:lvlOverride w:ilvl="7">
+      <w:startOverride w:val="1"/>
+    </w:lvlOverride>
+    <w:lvlOverride w:ilvl="8">
+      <w:startOverride w:val="1"/>
+    </w:lvlOverride>
+  </w:num>
+  <w:num w:numId="1010">
+    <w:abstractNumId w:val="99411"/>
+    <w:lvlOverride w:ilvl="0">
+      <w:startOverride w:val="1"/>
+    </w:lvlOverride>
+    <w:lvlOverride w:ilvl="1">
+      <w:startOverride w:val="1"/>
+    </w:lvlOverride>
+    <w:lvlOverride w:ilvl="2">
+      <w:startOverride w:val="1"/>
+    </w:lvlOverride>
+    <w:lvlOverride w:ilvl="3">
+      <w:startOverride w:val="1"/>
+    </w:lvlOverride>
+    <w:lvlOverride w:ilvl="4">
+      <w:startOverride w:val="1"/>
+    </w:lvlOverride>
+    <w:lvlOverride w:ilvl="5">
+      <w:startOverride w:val="1"/>
+    </w:lvlOverride>
+    <w:lvlOverride w:ilvl="6">
+      <w:startOverride w:val="1"/>
+    </w:lvlOverride>
+    <w:lvlOverride w:ilvl="7">
+      <w:startOverride w:val="1"/>
+    </w:lvlOverride>
+    <w:lvlOverride w:ilvl="8">
+      <w:startOverride w:val="1"/>
+    </w:lvlOverride>
+  </w:num>
+  <w:num w:numId="1011">
     <w:abstractNumId w:val="99411"/>
     <w:lvlOverride w:ilvl="0">
       <w:startOverride w:val="1"/>

</xml_diff>

<commit_message>
Añade los escenarios de riesgo al informe Word de la FACSO
- Nueva parte "Escenarios de riesgo" (metodología, los 3 escenarios, población
  desagregada por edad y medidas por escenario) entre Situación y Recomendaciones.
- Versiona el fuente del informe (informes/fuente-informe-facso.qmd), excluido del
  render del sitio; regenera el .docx (con enlace a la sección web).

Co-Authored-By: Claude Opus 4.8 <noreply@anthropic.com>
</commit_message>
<xml_diff>
--- a/informes/informe-elnino-facso-una.docx
+++ b/informes/informe-elnino-facso-una.docx
@@ -7,7 +7,7 @@
         <w:pStyle w:val="Title"/>
       </w:pPr>
       <w:r>
-        <w:t xml:space="preserve">El Niño 2026–2027: situación, evolución y recomendaciones para la Facultad de Ciencias Sociales (UNA)</w:t>
+        <w:t xml:space="preserve">El Niño 2026-2027: situación, escenarios y recomendaciones para la Facultad de Ciencias Sociales (UNA)</w:t>
       </w:r>
     </w:p>
     <w:p>
@@ -41,9 +41,35 @@
         <w:pStyle w:val="Date"/>
       </w:pPr>
       <w:r>
-        <w:t xml:space="preserve">2026-07-01</w:t>
-      </w:r>
-    </w:p>
+        <w:t xml:space="preserve">2026-08-15</w:t>
+      </w:r>
+    </w:p>
+    <w:sdt>
+      <w:sdtPr>
+        <w:docPartObj>
+          <w:docPartGallery w:val="Table of Contents"/>
+          <w:docPartUnique/>
+        </w:docPartObj>
+      </w:sdtPr>
+      <w:sdtContent>
+        <w:p>
+          <w:pPr>
+            <w:pStyle w:val="TOCHeading"/>
+          </w:pPr>
+          <w:r>
+            <w:t xml:space="preserve">Contenido</w:t>
+          </w:r>
+        </w:p>
+        <w:p>
+          <w:r>
+            <w:fldChar w:fldCharType="begin" w:dirty="true"/>
+            <w:instrText xml:space="preserve">TOC \o "1-3" \h \z \u</w:instrText>
+            <w:fldChar w:fldCharType="separate"/>
+            <w:fldChar w:fldCharType="end"/>
+          </w:r>
+        </w:p>
+      </w:sdtContent>
+    </w:sdt>
     <w:bookmarkStart w:id="15" w:name="X6ebb0b0fd9c1e49f040bb5692c31db3ccbd88cd"/>
     <w:p>
       <w:pPr>
@@ -106,21 +132,21 @@
           <w:b/>
           <w:bCs/>
         </w:rPr>
-        <w:t xml:space="preserve">81 % de probabilidad de un El Niño muy fuerte en octubre–diciembre</w:t>
-      </w:r>
-      <w:r>
-        <w:rPr>
-          <w:b/>
-          <w:bCs/>
-        </w:rPr>
-        <w:t xml:space="preserve"> </w:t>
-      </w:r>
-      <w:r>
-        <w:rPr>
-          <w:b/>
-          <w:bCs/>
-        </w:rPr>
-        <w:t xml:space="preserve">de 2026</w:t>
+        <w:t xml:space="preserve">81 % de probabilidad de un El Niño muy fuerte en</w:t>
+      </w:r>
+      <w:r>
+        <w:rPr>
+          <w:b/>
+          <w:bCs/>
+        </w:rPr>
+        <w:t xml:space="preserve"> </w:t>
+      </w:r>
+      <w:r>
+        <w:rPr>
+          <w:b/>
+          <w:bCs/>
+        </w:rPr>
+        <w:t xml:space="preserve">octubre–diciembre de 2026</w:t>
       </w:r>
       <w:r>
         <w:t xml:space="preserve"> </w:t>
@@ -136,21 +162,21 @@
           <w:b/>
           <w:bCs/>
         </w:rPr>
-        <w:t xml:space="preserve">97 % de que persista hasta</w:t>
-      </w:r>
-      <w:r>
-        <w:rPr>
-          <w:b/>
-          <w:bCs/>
-        </w:rPr>
-        <w:t xml:space="preserve"> </w:t>
-      </w:r>
-      <w:r>
-        <w:rPr>
-          <w:b/>
-          <w:bCs/>
-        </w:rPr>
-        <w:t xml:space="preserve">inicios de 2027</w:t>
+        <w:t xml:space="preserve">97 % de</w:t>
+      </w:r>
+      <w:r>
+        <w:rPr>
+          <w:b/>
+          <w:bCs/>
+        </w:rPr>
+        <w:t xml:space="preserve"> </w:t>
+      </w:r>
+      <w:r>
+        <w:rPr>
+          <w:b/>
+          <w:bCs/>
+        </w:rPr>
+        <w:t xml:space="preserve">que persista hasta inicios de 2027</w:t>
       </w:r>
       <w:r>
         <w:t xml:space="preserve"> </w:t>
@@ -442,13 +468,13 @@
         <w:t xml:space="preserve">terciles</w:t>
       </w:r>
       <w:r>
-        <w:t xml:space="preserve">; con el El Niño en curso,</w:t>
-      </w:r>
-      <w:r>
-        <w:t xml:space="preserve"> </w:t>
-      </w:r>
-      <w:r>
-        <w:t xml:space="preserve">la balanza se inclina al tercil</w:t>
+        <w:t xml:space="preserve">; con el El Niño en</w:t>
+      </w:r>
+      <w:r>
+        <w:t xml:space="preserve"> </w:t>
+      </w:r>
+      <w:r>
+        <w:t xml:space="preserve">curso, la balanza se inclina al tercil</w:t>
       </w:r>
       <w:r>
         <w:t xml:space="preserve"> </w:t>
@@ -464,19 +490,13 @@
         <w:t xml:space="preserve"> </w:t>
       </w:r>
       <w:r>
-        <w:t xml:space="preserve">para el centro-sur y el</w:t>
-      </w:r>
-      <w:r>
-        <w:t xml:space="preserve"> </w:t>
-      </w:r>
-      <w:r>
-        <w:t xml:space="preserve">este en primavera-verano</w:t>
-      </w:r>
-      <w:r>
-        <w:t xml:space="preserve"> </w:t>
-      </w:r>
-      <w:r>
-        <w:t xml:space="preserve">(</w:t>
+        <w:t xml:space="preserve">para el centro-sur</w:t>
+      </w:r>
+      <w:r>
+        <w:t xml:space="preserve"> </w:t>
+      </w:r>
+      <w:r>
+        <w:t xml:space="preserve">y el este en primavera-verano (</w:t>
       </w:r>
       <w:hyperlink r:id="rId13">
         <w:r>
@@ -549,19 +569,19 @@
         <w:t xml:space="preserve"> </w:t>
       </w:r>
       <w:r>
-        <w:t xml:space="preserve">—raudales por lluvia intensa sobre un drenaje</w:t>
-      </w:r>
-      <w:r>
-        <w:t xml:space="preserve"> </w:t>
-      </w:r>
-      <w:r>
-        <w:t xml:space="preserve">insuficiente, que anegan calles y los puntos críticos de Asunción y ciudades de Central—</w:t>
-      </w:r>
-      <w:r>
-        <w:t xml:space="preserve"> </w:t>
-      </w:r>
-      <w:r>
-        <w:t xml:space="preserve">y en</w:t>
+        <w:t xml:space="preserve">—raudales por lluvia intensa sobre un</w:t>
+      </w:r>
+      <w:r>
+        <w:t xml:space="preserve"> </w:t>
+      </w:r>
+      <w:r>
+        <w:t xml:space="preserve">drenaje insuficiente, que anegan calles y los puntos críticos de Asunción y ciudades de</w:t>
+      </w:r>
+      <w:r>
+        <w:t xml:space="preserve"> </w:t>
+      </w:r>
+      <w:r>
+        <w:t xml:space="preserve">Central— y en</w:t>
       </w:r>
       <w:r>
         <w:t xml:space="preserve"> </w:t>
@@ -587,21 +607,21 @@
           <w:b/>
           <w:bCs/>
         </w:rPr>
-        <w:t xml:space="preserve">bañados Norte y Sur</w:t>
-      </w:r>
-      <w:r>
-        <w:rPr>
-          <w:b/>
-          <w:bCs/>
-        </w:rPr>
-        <w:t xml:space="preserve"> </w:t>
-      </w:r>
-      <w:r>
-        <w:rPr>
-          <w:b/>
-          <w:bCs/>
-        </w:rPr>
-        <w:t xml:space="preserve">y La Chacarita</w:t>
+        <w:t xml:space="preserve">bañados</w:t>
+      </w:r>
+      <w:r>
+        <w:rPr>
+          <w:b/>
+          <w:bCs/>
+        </w:rPr>
+        <w:t xml:space="preserve"> </w:t>
+      </w:r>
+      <w:r>
+        <w:rPr>
+          <w:b/>
+          <w:bCs/>
+        </w:rPr>
+        <w:t xml:space="preserve">Norte y Sur y La Chacarita</w:t>
       </w:r>
       <w:r>
         <w:t xml:space="preserve">—, además del</w:t>
@@ -620,7 +640,13 @@
         <w:t xml:space="preserve"> </w:t>
       </w:r>
       <w:r>
-        <w:t xml:space="preserve">en el periurbano (agua estancada + calor). La</w:t>
+        <w:t xml:space="preserve">en el periurbano (agua estancada +</w:t>
+      </w:r>
+      <w:r>
+        <w:t xml:space="preserve"> </w:t>
+      </w:r>
+      <w:r>
+        <w:t xml:space="preserve">calor). La</w:t>
       </w:r>
       <w:r>
         <w:t xml:space="preserve"> </w:t>
@@ -636,13 +662,13 @@
         <w:t xml:space="preserve"> </w:t>
       </w:r>
       <w:r>
-        <w:t xml:space="preserve">prepara la respuesta metropolitana (limpieza de cauces y albergues con la</w:t>
-      </w:r>
-      <w:r>
-        <w:t xml:space="preserve"> </w:t>
-      </w:r>
-      <w:r>
-        <w:t xml:space="preserve">Municipalidad de Asunción); con el río en</w:t>
+        <w:t xml:space="preserve">prepara la respuesta metropolitana (limpieza de cauces y albergues</w:t>
+      </w:r>
+      <w:r>
+        <w:t xml:space="preserve"> </w:t>
+      </w:r>
+      <w:r>
+        <w:t xml:space="preserve">con la Municipalidad de Asunción); con el río en</w:t>
       </w:r>
       <w:r>
         <w:t xml:space="preserve"> </w:t>
@@ -671,13 +697,13 @@
         <w:t xml:space="preserve"> </w:t>
       </w:r>
       <w:r>
-        <w:t xml:space="preserve">de Asunción</w:t>
-      </w:r>
-      <w:r>
-        <w:t xml:space="preserve"> </w:t>
-      </w:r>
-      <w:r>
-        <w:t xml:space="preserve">podrían afectarse, y el episodio se extendería hasta</w:t>
+        <w:t xml:space="preserve">de</w:t>
+      </w:r>
+      <w:r>
+        <w:t xml:space="preserve"> </w:t>
+      </w:r>
+      <w:r>
+        <w:t xml:space="preserve">Asunción podrían afectarse, y el episodio se extendería hasta</w:t>
       </w:r>
       <w:r>
         <w:t xml:space="preserve"> </w:t>
@@ -738,13 +764,13 @@
         <w:t xml:space="preserve"> </w:t>
       </w:r>
       <w:r>
-        <w:t xml:space="preserve">—inclina la balanza, no fija el día—; en</w:t>
-      </w:r>
-      <w:r>
-        <w:t xml:space="preserve"> </w:t>
-      </w:r>
-      <w:r>
-        <w:t xml:space="preserve">el</w:t>
+        <w:t xml:space="preserve">—inclina la balanza, no fija el día—;</w:t>
+      </w:r>
+      <w:r>
+        <w:t xml:space="preserve"> </w:t>
+      </w:r>
+      <w:r>
+        <w:t xml:space="preserve">en el</w:t>
       </w:r>
       <w:r>
         <w:t xml:space="preserve"> </w:t>
@@ -776,13 +802,7 @@
         <w:t xml:space="preserve"> </w:t>
       </w:r>
       <w:r>
-        <w:t xml:space="preserve">(temporales</w:t>
-      </w:r>
-      <w:r>
-        <w:t xml:space="preserve"> </w:t>
-      </w:r>
-      <w:r>
-        <w:t xml:space="preserve">y raudales), más probables esta temporada. El desastre está</w:t>
+        <w:t xml:space="preserve">(temporales y raudales), más probables esta temporada. El desastre está</w:t>
       </w:r>
       <w:r>
         <w:t xml:space="preserve"> </w:t>
@@ -795,13 +815,13 @@
         <w:t xml:space="preserve">anunciado</w:t>
       </w:r>
       <w:r>
-        <w:t xml:space="preserve">: el clima se</w:t>
-      </w:r>
-      <w:r>
-        <w:t xml:space="preserve"> </w:t>
-      </w:r>
-      <w:r>
-        <w:t xml:space="preserve">pronostica y la vulnerabilidad se conoce.</w:t>
+        <w:t xml:space="preserve">:</w:t>
+      </w:r>
+      <w:r>
+        <w:t xml:space="preserve"> </w:t>
+      </w:r>
+      <w:r>
+        <w:t xml:space="preserve">el clima se pronostica y la vulnerabilidad se conoce.</w:t>
       </w:r>
     </w:p>
     <w:p>
@@ -810,12 +830,1744 @@
       </w:r>
     </w:p>
     <w:bookmarkEnd w:id="15"/>
-    <w:bookmarkStart w:id="22" w:name="X0cf2b25fa38a48424544e6514685921bd9ac587"/>
+    <w:bookmarkStart w:id="20" w:name="Xab710521bed3e576670b6ffe9283eca2cf6af39"/>
     <w:p>
       <w:pPr>
         <w:pStyle w:val="Heading1"/>
       </w:pPr>
       <w:r>
+        <w:t xml:space="preserve">Escenarios de riesgo para el Gran Asunción (2026-2027)</w:t>
+      </w:r>
+    </w:p>
+    <w:p>
+      <w:pPr>
+        <w:pStyle w:val="FirstParagraph"/>
+      </w:pPr>
+      <w:r>
+        <w:t xml:space="preserve">Los escenarios</w:t>
+      </w:r>
+      <w:r>
+        <w:t xml:space="preserve"> </w:t>
+      </w:r>
+      <w:r>
+        <w:rPr>
+          <w:b/>
+          <w:bCs/>
+        </w:rPr>
+        <w:t xml:space="preserve">no son predicciones</w:t>
+      </w:r>
+      <w:r>
+        <w:t xml:space="preserve">: son</w:t>
+      </w:r>
+      <w:r>
+        <w:t xml:space="preserve"> </w:t>
+      </w:r>
+      <w:r>
+        <w:rPr>
+          <w:b/>
+          <w:bCs/>
+        </w:rPr>
+        <w:t xml:space="preserve">futuros plausibles</w:t>
+      </w:r>
+      <w:r>
+        <w:t xml:space="preserve"> </w:t>
+      </w:r>
+      <w:r>
+        <w:t xml:space="preserve">que sirven para</w:t>
+      </w:r>
+      <w:r>
+        <w:t xml:space="preserve"> </w:t>
+      </w:r>
+      <w:r>
+        <w:t xml:space="preserve">ordenar la preparación. Responden a</w:t>
+      </w:r>
+      <w:r>
+        <w:t xml:space="preserve"> </w:t>
+      </w:r>
+      <w:r>
+        <w:rPr>
+          <w:i/>
+          <w:iCs/>
+        </w:rPr>
+        <w:t xml:space="preserve">“¿qué pasaría si…?”</w:t>
+      </w:r>
+      <w:r>
+        <w:t xml:space="preserve"> </w:t>
+      </w:r>
+      <w:r>
+        <w:t xml:space="preserve">para que las decisiones se</w:t>
+      </w:r>
+      <w:r>
+        <w:t xml:space="preserve"> </w:t>
+      </w:r>
+      <w:r>
+        <w:t xml:space="preserve">tomen</w:t>
+      </w:r>
+      <w:r>
+        <w:t xml:space="preserve"> </w:t>
+      </w:r>
+      <w:r>
+        <w:rPr>
+          <w:b/>
+          <w:bCs/>
+        </w:rPr>
+        <w:t xml:space="preserve">antes</w:t>
+      </w:r>
+      <w:r>
+        <w:t xml:space="preserve"> </w:t>
+      </w:r>
+      <w:r>
+        <w:t xml:space="preserve">y no durante la emergencia. Cada uno cruza el</w:t>
+      </w:r>
+      <w:r>
+        <w:t xml:space="preserve"> </w:t>
+      </w:r>
+      <w:r>
+        <w:rPr>
+          <w:b/>
+          <w:bCs/>
+        </w:rPr>
+        <w:t xml:space="preserve">clima esperado</w:t>
+      </w:r>
+      <w:r>
+        <w:t xml:space="preserve"> </w:t>
+      </w:r>
+      <w:r>
+        <w:t xml:space="preserve">con</w:t>
+      </w:r>
+      <w:r>
+        <w:t xml:space="preserve"> </w:t>
+      </w:r>
+      <w:r>
+        <w:rPr>
+          <w:b/>
+          <w:bCs/>
+        </w:rPr>
+        <w:t xml:space="preserve">quién está expuesto</w:t>
+      </w:r>
+      <w:r>
+        <w:t xml:space="preserve">, porque el desastre no lo fija la amenaza sola, sino su</w:t>
+      </w:r>
+      <w:r>
+        <w:t xml:space="preserve"> </w:t>
+      </w:r>
+      <w:r>
+        <w:t xml:space="preserve">encuentro con la</w:t>
+      </w:r>
+      <w:r>
+        <w:t xml:space="preserve"> </w:t>
+      </w:r>
+      <w:r>
+        <w:rPr>
+          <w:b/>
+          <w:bCs/>
+        </w:rPr>
+        <w:t xml:space="preserve">vulnerabilidad</w:t>
+      </w:r>
+      <w:r>
+        <w:t xml:space="preserve">.</w:t>
+      </w:r>
+    </w:p>
+    <w:p>
+      <w:pPr>
+        <w:pStyle w:val="BodyText"/>
+      </w:pPr>
+      <w:r>
+        <w:rPr>
+          <w:b/>
+          <w:bCs/>
+        </w:rPr>
+        <w:t xml:space="preserve">Cómo se construyen.</w:t>
+      </w:r>
+      <w:r>
+        <w:t xml:space="preserve"> </w:t>
+      </w:r>
+      <w:r>
+        <w:t xml:space="preserve">Se combinan cuatro piezas, todas con fuente: (1) el</w:t>
+      </w:r>
+      <w:r>
+        <w:t xml:space="preserve"> </w:t>
+      </w:r>
+      <w:r>
+        <w:rPr>
+          <w:b/>
+          <w:bCs/>
+        </w:rPr>
+        <w:t xml:space="preserve">pronóstico</w:t>
+      </w:r>
+      <w:r>
+        <w:t xml:space="preserve"> </w:t>
+      </w:r>
+      <w:r>
+        <w:t xml:space="preserve">del episodio (NOAA/OMM/DINAC) fija la</w:t>
+      </w:r>
+      <w:r>
+        <w:t xml:space="preserve"> </w:t>
+      </w:r>
+      <w:r>
+        <w:rPr>
+          <w:i/>
+          <w:iCs/>
+        </w:rPr>
+        <w:t xml:space="preserve">plausibilidad</w:t>
+      </w:r>
+      <w:r>
+        <w:t xml:space="preserve">; (2) los</w:t>
+      </w:r>
+      <w:r>
+        <w:t xml:space="preserve"> </w:t>
+      </w:r>
+      <w:r>
+        <w:rPr>
+          <w:b/>
+          <w:bCs/>
+        </w:rPr>
+        <w:t xml:space="preserve">umbrales de cota</w:t>
+      </w:r>
+      <w:r>
+        <w:t xml:space="preserve"> </w:t>
+      </w:r>
+      <w:r>
+        <w:t xml:space="preserve">del río Paraguay en Asunción (5,5 m etapa crítica; 7,57 m pico de</w:t>
+      </w:r>
+      <w:r>
+        <w:t xml:space="preserve"> </w:t>
+      </w:r>
+      <w:r>
+        <w:t xml:space="preserve">2019; 7,84 m de 2015-16) ordenan la</w:t>
+      </w:r>
+      <w:r>
+        <w:t xml:space="preserve"> </w:t>
+      </w:r>
+      <w:r>
+        <w:rPr>
+          <w:i/>
+          <w:iCs/>
+        </w:rPr>
+        <w:t xml:space="preserve">severidad</w:t>
+      </w:r>
+      <w:r>
+        <w:t xml:space="preserve">; (3) la</w:t>
+      </w:r>
+      <w:r>
+        <w:t xml:space="preserve"> </w:t>
+      </w:r>
+      <w:r>
+        <w:rPr>
+          <w:b/>
+          <w:bCs/>
+        </w:rPr>
+        <w:t xml:space="preserve">exposición modelada</w:t>
+      </w:r>
+      <w:r>
+        <w:t xml:space="preserve"> </w:t>
+      </w:r>
+      <w:r>
+        <w:t xml:space="preserve">cruza la</w:t>
+      </w:r>
+      <w:r>
+        <w:t xml:space="preserve"> </w:t>
+      </w:r>
+      <w:r>
+        <w:t xml:space="preserve">malla de población Kontur con la</w:t>
+      </w:r>
+      <w:r>
+        <w:t xml:space="preserve"> </w:t>
+      </w:r>
+      <w:r>
+        <w:rPr>
+          <w:b/>
+          <w:bCs/>
+        </w:rPr>
+        <w:t xml:space="preserve">huella de inundación</w:t>
+      </w:r>
+      <w:r>
+        <w:t xml:space="preserve"> </w:t>
+      </w:r>
+      <w:r>
+        <w:t xml:space="preserve">del episodio análogo —derivada</w:t>
+      </w:r>
+      <w:r>
+        <w:t xml:space="preserve"> </w:t>
+      </w:r>
+      <w:r>
+        <w:t xml:space="preserve">de imágenes Sentinel-1— y la</w:t>
+      </w:r>
+      <w:r>
+        <w:t xml:space="preserve"> </w:t>
+      </w:r>
+      <w:r>
+        <w:rPr>
+          <w:b/>
+          <w:bCs/>
+        </w:rPr>
+        <w:t xml:space="preserve">desagrega por edad</w:t>
+      </w:r>
+      <w:r>
+        <w:t xml:space="preserve"> </w:t>
+      </w:r>
+      <w:r>
+        <w:t xml:space="preserve">con la estructura etaria</w:t>
+      </w:r>
+      <w:r>
+        <w:t xml:space="preserve"> </w:t>
+      </w:r>
+      <w:r>
+        <w:t xml:space="preserve">departamental (COD-PS 2023); y (4) los</w:t>
+      </w:r>
+      <w:r>
+        <w:t xml:space="preserve"> </w:t>
+      </w:r>
+      <w:r>
+        <w:rPr>
+          <w:b/>
+          <w:bCs/>
+        </w:rPr>
+        <w:t xml:space="preserve">análogos históricos observados</w:t>
+      </w:r>
+      <w:r>
+        <w:t xml:space="preserve"> </w:t>
+      </w:r>
+      <w:r>
+        <w:t xml:space="preserve">(2019 y</w:t>
+      </w:r>
+      <w:r>
+        <w:t xml:space="preserve"> </w:t>
+      </w:r>
+      <w:r>
+        <w:t xml:space="preserve">2015-16) aportan la afectación realmente registrada.</w:t>
+      </w:r>
+    </w:p>
+    <w:bookmarkStart w:id="16" w:name="los-tres-escenarios"/>
+    <w:p>
+      <w:pPr>
+        <w:pStyle w:val="Heading2"/>
+      </w:pPr>
+      <w:r>
+        <w:t xml:space="preserve">Los tres escenarios</w:t>
+      </w:r>
+    </w:p>
+    <w:tbl>
+      <w:tblPr>
+        <w:tblStyle w:val="Table"/>
+        <w:tblW w:type="pct" w:w="5000"/>
+        <w:tblLayout w:type="fixed"/>
+        <w:tblLook w:firstRow="1" w:lastRow="0" w:firstColumn="0" w:lastColumn="0" w:noHBand="0" w:noVBand="0" w:val="0020"/>
+      </w:tblPr>
+      <w:tblGrid>
+        <w:gridCol w:w="1980"/>
+        <w:gridCol w:w="1980"/>
+        <w:gridCol w:w="1980"/>
+        <w:gridCol w:w="1980"/>
+      </w:tblGrid>
+      <w:tr>
+        <w:trPr>
+          <w:tblHeader w:val="on"/>
+        </w:trPr>
+        <w:tc>
+          <w:tcPr/>
+          <w:p>
+            <w:pPr>
+              <w:pStyle w:val="Compact"/>
+            </w:pPr>
+            <w:r>
+              <w:t xml:space="preserve">Escenario</w:t>
+            </w:r>
+          </w:p>
+        </w:tc>
+        <w:tc>
+          <w:tcPr/>
+          <w:p>
+            <w:pPr>
+              <w:pStyle w:val="Compact"/>
+            </w:pPr>
+            <w:r>
+              <w:t xml:space="preserve">Detonante hidroclimático</w:t>
+            </w:r>
+          </w:p>
+        </w:tc>
+        <w:tc>
+          <w:tcPr/>
+          <w:p>
+            <w:pPr>
+              <w:pStyle w:val="Compact"/>
+            </w:pPr>
+            <w:r>
+              <w:t xml:space="preserve">Qué pasaría en el Gran Asunción</w:t>
+            </w:r>
+          </w:p>
+        </w:tc>
+        <w:tc>
+          <w:tcPr/>
+          <w:p>
+            <w:pPr>
+              <w:pStyle w:val="Compact"/>
+            </w:pPr>
+            <w:r>
+              <w:t xml:space="preserve">Análogo histórico</w:t>
+            </w:r>
+          </w:p>
+        </w:tc>
+      </w:tr>
+      <w:tr>
+        <w:tc>
+          <w:tcPr/>
+          <w:p>
+            <w:pPr>
+              <w:pStyle w:val="Compact"/>
+            </w:pPr>
+            <w:r>
+              <w:rPr>
+                <w:b/>
+                <w:bCs/>
+              </w:rPr>
+              <w:t xml:space="preserve">1 · Esperado</w:t>
+            </w:r>
+            <w:r>
+              <w:t xml:space="preserve"> </w:t>
+            </w:r>
+            <w:r>
+              <w:rPr>
+                <w:i/>
+                <w:iCs/>
+              </w:rPr>
+              <w:t xml:space="preserve">(más probable)</w:t>
+            </w:r>
+          </w:p>
+        </w:tc>
+        <w:tc>
+          <w:tcPr/>
+          <w:p>
+            <w:pPr>
+              <w:pStyle w:val="Compact"/>
+            </w:pPr>
+            <w:r>
+              <w:t xml:space="preserve">Primavera-verano lluviosos con temporales frecuentes; el río sube pero se mantiene bajo la etapa crítica (&lt; 5,5 m)</w:t>
+            </w:r>
+          </w:p>
+        </w:tc>
+        <w:tc>
+          <w:tcPr/>
+          <w:p>
+            <w:pPr>
+              <w:pStyle w:val="Compact"/>
+            </w:pPr>
+            <w:r>
+              <w:t xml:space="preserve">Inundación</w:t>
+            </w:r>
+            <w:r>
+              <w:t xml:space="preserve"> </w:t>
+            </w:r>
+            <w:r>
+              <w:rPr>
+                <w:b/>
+                <w:bCs/>
+              </w:rPr>
+              <w:t xml:space="preserve">pluvial</w:t>
+            </w:r>
+            <w:r>
+              <w:t xml:space="preserve"> </w:t>
+            </w:r>
+            <w:r>
+              <w:t xml:space="preserve">recurrente: raudales y anegamientos en puntos críticos, cortes de tránsito y energía, clases suspendidas por jornada; dengue de verano al alza</w:t>
+            </w:r>
+          </w:p>
+        </w:tc>
+        <w:tc>
+          <w:tcPr/>
+          <w:p>
+            <w:pPr>
+              <w:pStyle w:val="Compact"/>
+            </w:pPr>
+            <w:r>
+              <w:t xml:space="preserve">Temporal del 13-abr-2024 en Asunción y Central</w:t>
+            </w:r>
+          </w:p>
+        </w:tc>
+      </w:tr>
+      <w:tr>
+        <w:tc>
+          <w:tcPr/>
+          <w:p>
+            <w:pPr>
+              <w:pStyle w:val="Compact"/>
+            </w:pPr>
+            <w:r>
+              <w:rPr>
+                <w:b/>
+                <w:bCs/>
+              </w:rPr>
+              <w:t xml:space="preserve">2 · Severo</w:t>
+            </w:r>
+          </w:p>
+        </w:tc>
+        <w:tc>
+          <w:tcPr/>
+          <w:p>
+            <w:pPr>
+              <w:pStyle w:val="Compact"/>
+            </w:pPr>
+            <w:r>
+              <w:t xml:space="preserve">Lluvias sostenidas en la cuenca alta → río a ~7,5 m (nivel de 2019)</w:t>
+            </w:r>
+          </w:p>
+        </w:tc>
+        <w:tc>
+          <w:tcPr/>
+          <w:p>
+            <w:pPr>
+              <w:pStyle w:val="Compact"/>
+            </w:pPr>
+            <w:r>
+              <w:t xml:space="preserve">Afectación</w:t>
+            </w:r>
+            <w:r>
+              <w:t xml:space="preserve"> </w:t>
+            </w:r>
+            <w:r>
+              <w:rPr>
+                <w:b/>
+                <w:bCs/>
+              </w:rPr>
+              <w:t xml:space="preserve">fluvial</w:t>
+            </w:r>
+            <w:r>
+              <w:t xml:space="preserve">: evacuación de bañados Norte y Sur y La Chacarita; escuelas y servicios de salud de la zona baja anegados; crecida y temporales combinados</w:t>
+            </w:r>
+          </w:p>
+        </w:tc>
+        <w:tc>
+          <w:tcPr/>
+          <w:p>
+            <w:pPr>
+              <w:pStyle w:val="Compact"/>
+            </w:pPr>
+            <w:r>
+              <w:t xml:space="preserve">Crecida de 2019 (7,57 m; 14.823 familias desplazadas)</w:t>
+            </w:r>
+          </w:p>
+        </w:tc>
+      </w:tr>
+      <w:tr>
+        <w:tc>
+          <w:tcPr/>
+          <w:p>
+            <w:pPr>
+              <w:pStyle w:val="Compact"/>
+            </w:pPr>
+            <w:r>
+              <w:rPr>
+                <w:b/>
+                <w:bCs/>
+              </w:rPr>
+              <w:t xml:space="preserve">3 · Extremo</w:t>
+            </w:r>
+          </w:p>
+        </w:tc>
+        <w:tc>
+          <w:tcPr/>
+          <w:p>
+            <w:pPr>
+              <w:pStyle w:val="Compact"/>
+            </w:pPr>
+            <w:r>
+              <w:t xml:space="preserve">El Niño</w:t>
+            </w:r>
+            <w:r>
+              <w:t xml:space="preserve"> </w:t>
+            </w:r>
+            <w:r>
+              <w:rPr>
+                <w:i/>
+                <w:iCs/>
+              </w:rPr>
+              <w:t xml:space="preserve">muy fuerte</w:t>
+            </w:r>
+            <w:r>
+              <w:t xml:space="preserve"> </w:t>
+            </w:r>
+            <w:r>
+              <w:t xml:space="preserve">con río ≥ 7,84 m y amenazas encadenadas</w:t>
+            </w:r>
+          </w:p>
+        </w:tc>
+        <w:tc>
+          <w:tcPr/>
+          <w:p>
+            <w:pPr>
+              <w:pStyle w:val="Compact"/>
+            </w:pPr>
+            <w:r>
+              <w:t xml:space="preserve">Desplazamiento masivo; tensión sobre los servicios; secuencia inundación → temporales → dengue posinundación</w:t>
+            </w:r>
+          </w:p>
+        </w:tc>
+        <w:tc>
+          <w:tcPr/>
+          <w:p>
+            <w:pPr>
+              <w:pStyle w:val="Compact"/>
+            </w:pPr>
+            <w:r>
+              <w:t xml:space="preserve">El Niño 2015-16 (7,84 m; más de 21.000 desplazados)</w:t>
+            </w:r>
+          </w:p>
+        </w:tc>
+      </w:tr>
+    </w:tbl>
+    <w:bookmarkEnd w:id="16"/>
+    <w:bookmarkStart w:id="17" w:name="población-expuesta-desagregada"/>
+    <w:p>
+      <w:pPr>
+        <w:pStyle w:val="Heading2"/>
+      </w:pPr>
+      <w:r>
+        <w:t xml:space="preserve">Población expuesta, desagregada</w:t>
+      </w:r>
+    </w:p>
+    <w:p>
+      <w:pPr>
+        <w:pStyle w:val="FirstParagraph"/>
+      </w:pPr>
+      <w:r>
+        <w:t xml:space="preserve">Exposición</w:t>
+      </w:r>
+      <w:r>
+        <w:t xml:space="preserve"> </w:t>
+      </w:r>
+      <w:r>
+        <w:rPr>
+          <w:b/>
+          <w:bCs/>
+        </w:rPr>
+        <w:t xml:space="preserve">modelada</w:t>
+      </w:r>
+      <w:r>
+        <w:t xml:space="preserve"> </w:t>
+      </w:r>
+      <w:r>
+        <w:t xml:space="preserve">por escenario (población dentro de la huella de inundación, con</w:t>
+      </w:r>
+      <w:r>
+        <w:t xml:space="preserve"> </w:t>
+      </w:r>
+      <w:r>
+        <w:t xml:space="preserve">niñez y adultos mayores, y establecimientos en la zona). Datos a agosto de 2026.</w:t>
+      </w:r>
+    </w:p>
+    <w:tbl>
+      <w:tblPr>
+        <w:tblStyle w:val="Table"/>
+        <w:tblW w:type="pct" w:w="5000"/>
+        <w:tblLayout w:type="fixed"/>
+        <w:tblLook w:firstRow="1" w:lastRow="0" w:firstColumn="0" w:lastColumn="0" w:noHBand="0" w:noVBand="0" w:val="0020"/>
+      </w:tblPr>
+      <w:tblGrid>
+        <w:gridCol w:w="1584"/>
+        <w:gridCol w:w="2112"/>
+        <w:gridCol w:w="2112"/>
+        <w:gridCol w:w="2112"/>
+      </w:tblGrid>
+      <w:tr>
+        <w:trPr>
+          <w:tblHeader w:val="on"/>
+        </w:trPr>
+        <w:tc>
+          <w:tcPr/>
+          <w:p>
+            <w:pPr>
+              <w:pStyle w:val="Compact"/>
+            </w:pPr>
+            <w:r>
+              <w:t xml:space="preserve">Indicador</w:t>
+            </w:r>
+          </w:p>
+        </w:tc>
+        <w:tc>
+          <w:tcPr/>
+          <w:p>
+            <w:pPr>
+              <w:pStyle w:val="Compact"/>
+              <w:jc w:val="right"/>
+            </w:pPr>
+            <w:r>
+              <w:t xml:space="preserve">1 · Esperado (pluvial)</w:t>
+            </w:r>
+          </w:p>
+        </w:tc>
+        <w:tc>
+          <w:tcPr/>
+          <w:p>
+            <w:pPr>
+              <w:pStyle w:val="Compact"/>
+              <w:jc w:val="right"/>
+            </w:pPr>
+            <w:r>
+              <w:t xml:space="preserve">2 · Severo (~2019)</w:t>
+            </w:r>
+          </w:p>
+        </w:tc>
+        <w:tc>
+          <w:tcPr/>
+          <w:p>
+            <w:pPr>
+              <w:pStyle w:val="Compact"/>
+              <w:jc w:val="right"/>
+            </w:pPr>
+            <w:r>
+              <w:t xml:space="preserve">3 · Extremo (~2015-16)</w:t>
+            </w:r>
+          </w:p>
+        </w:tc>
+      </w:tr>
+      <w:tr>
+        <w:tc>
+          <w:tcPr/>
+          <w:p>
+            <w:pPr>
+              <w:pStyle w:val="Compact"/>
+            </w:pPr>
+            <w:r>
+              <w:rPr>
+                <w:b/>
+                <w:bCs/>
+              </w:rPr>
+              <w:t xml:space="preserve">Población en la huella</w:t>
+            </w:r>
+          </w:p>
+        </w:tc>
+        <w:tc>
+          <w:tcPr/>
+          <w:p>
+            <w:pPr>
+              <w:pStyle w:val="Compact"/>
+              <w:jc w:val="right"/>
+            </w:pPr>
+            <w:r>
+              <w:rPr>
+                <w:b/>
+                <w:bCs/>
+              </w:rPr>
+              <w:t xml:space="preserve">10.661</w:t>
+            </w:r>
+          </w:p>
+        </w:tc>
+        <w:tc>
+          <w:tcPr/>
+          <w:p>
+            <w:pPr>
+              <w:pStyle w:val="Compact"/>
+              <w:jc w:val="right"/>
+            </w:pPr>
+            <w:r>
+              <w:rPr>
+                <w:b/>
+                <w:bCs/>
+              </w:rPr>
+              <w:t xml:space="preserve">40.817</w:t>
+            </w:r>
+          </w:p>
+        </w:tc>
+        <w:tc>
+          <w:tcPr/>
+          <w:p>
+            <w:pPr>
+              <w:pStyle w:val="Compact"/>
+              <w:jc w:val="right"/>
+            </w:pPr>
+            <w:r>
+              <w:rPr>
+                <w:b/>
+                <w:bCs/>
+              </w:rPr>
+              <w:t xml:space="preserve">34.202</w:t>
+            </w:r>
+          </w:p>
+        </w:tc>
+      </w:tr>
+      <w:tr>
+        <w:tc>
+          <w:tcPr/>
+          <w:p>
+            <w:pPr>
+              <w:pStyle w:val="Compact"/>
+            </w:pPr>
+            <w:r>
+              <w:t xml:space="preserve">— niñez (0-14)</w:t>
+            </w:r>
+          </w:p>
+        </w:tc>
+        <w:tc>
+          <w:tcPr/>
+          <w:p>
+            <w:pPr>
+              <w:pStyle w:val="Compact"/>
+              <w:jc w:val="right"/>
+            </w:pPr>
+            <w:r>
+              <w:t xml:space="preserve">s/d</w:t>
+            </w:r>
+          </w:p>
+        </w:tc>
+        <w:tc>
+          <w:tcPr/>
+          <w:p>
+            <w:pPr>
+              <w:pStyle w:val="Compact"/>
+              <w:jc w:val="right"/>
+            </w:pPr>
+            <w:r>
+              <w:t xml:space="preserve">7.691</w:t>
+            </w:r>
+          </w:p>
+        </w:tc>
+        <w:tc>
+          <w:tcPr/>
+          <w:p>
+            <w:pPr>
+              <w:pStyle w:val="Compact"/>
+              <w:jc w:val="right"/>
+            </w:pPr>
+            <w:r>
+              <w:t xml:space="preserve">7.171</w:t>
+            </w:r>
+          </w:p>
+        </w:tc>
+      </w:tr>
+      <w:tr>
+        <w:tc>
+          <w:tcPr/>
+          <w:p>
+            <w:pPr>
+              <w:pStyle w:val="Compact"/>
+            </w:pPr>
+            <w:r>
+              <w:t xml:space="preserve">— adultos mayores (65+)</w:t>
+            </w:r>
+          </w:p>
+        </w:tc>
+        <w:tc>
+          <w:tcPr/>
+          <w:p>
+            <w:pPr>
+              <w:pStyle w:val="Compact"/>
+              <w:jc w:val="right"/>
+            </w:pPr>
+            <w:r>
+              <w:t xml:space="preserve">s/d</w:t>
+            </w:r>
+          </w:p>
+        </w:tc>
+        <w:tc>
+          <w:tcPr/>
+          <w:p>
+            <w:pPr>
+              <w:pStyle w:val="Compact"/>
+              <w:jc w:val="right"/>
+            </w:pPr>
+            <w:r>
+              <w:t xml:space="preserve">2.907</w:t>
+            </w:r>
+          </w:p>
+        </w:tc>
+        <w:tc>
+          <w:tcPr/>
+          <w:p>
+            <w:pPr>
+              <w:pStyle w:val="Compact"/>
+              <w:jc w:val="right"/>
+            </w:pPr>
+            <w:r>
+              <w:t xml:space="preserve">3.074</w:t>
+            </w:r>
+          </w:p>
+        </w:tc>
+      </w:tr>
+      <w:tr>
+        <w:tc>
+          <w:tcPr/>
+          <w:p>
+            <w:pPr>
+              <w:pStyle w:val="Compact"/>
+            </w:pPr>
+            <w:r>
+              <w:t xml:space="preserve">Servicios de salud en la huella</w:t>
+            </w:r>
+          </w:p>
+        </w:tc>
+        <w:tc>
+          <w:tcPr/>
+          <w:p>
+            <w:pPr>
+              <w:pStyle w:val="Compact"/>
+              <w:jc w:val="right"/>
+            </w:pPr>
+            <w:r>
+              <w:t xml:space="preserve">0</w:t>
+            </w:r>
+          </w:p>
+        </w:tc>
+        <w:tc>
+          <w:tcPr/>
+          <w:p>
+            <w:pPr>
+              <w:pStyle w:val="Compact"/>
+              <w:jc w:val="right"/>
+            </w:pPr>
+            <w:r>
+              <w:t xml:space="preserve">4</w:t>
+            </w:r>
+          </w:p>
+        </w:tc>
+        <w:tc>
+          <w:tcPr/>
+          <w:p>
+            <w:pPr>
+              <w:pStyle w:val="Compact"/>
+              <w:jc w:val="right"/>
+            </w:pPr>
+            <w:r>
+              <w:t xml:space="preserve">6</w:t>
+            </w:r>
+          </w:p>
+        </w:tc>
+      </w:tr>
+      <w:tr>
+        <w:tc>
+          <w:tcPr/>
+          <w:p>
+            <w:pPr>
+              <w:pStyle w:val="Compact"/>
+            </w:pPr>
+            <w:r>
+              <w:t xml:space="preserve">Centros educativos en la huella</w:t>
+            </w:r>
+          </w:p>
+        </w:tc>
+        <w:tc>
+          <w:tcPr/>
+          <w:p>
+            <w:pPr>
+              <w:pStyle w:val="Compact"/>
+              <w:jc w:val="right"/>
+            </w:pPr>
+            <w:r>
+              <w:t xml:space="preserve">3</w:t>
+            </w:r>
+          </w:p>
+        </w:tc>
+        <w:tc>
+          <w:tcPr/>
+          <w:p>
+            <w:pPr>
+              <w:pStyle w:val="Compact"/>
+              <w:jc w:val="right"/>
+            </w:pPr>
+            <w:r>
+              <w:t xml:space="preserve">14</w:t>
+            </w:r>
+          </w:p>
+        </w:tc>
+        <w:tc>
+          <w:tcPr/>
+          <w:p>
+            <w:pPr>
+              <w:pStyle w:val="Compact"/>
+              <w:jc w:val="right"/>
+            </w:pPr>
+            <w:r>
+              <w:t xml:space="preserve">18</w:t>
+            </w:r>
+          </w:p>
+        </w:tc>
+      </w:tr>
+      <w:tr>
+        <w:tc>
+          <w:tcPr/>
+          <w:p>
+            <w:pPr>
+              <w:pStyle w:val="Compact"/>
+            </w:pPr>
+            <w:r>
+              <w:rPr>
+                <w:b/>
+                <w:bCs/>
+              </w:rPr>
+              <w:t xml:space="preserve">Afectación observada (histórica)</w:t>
+            </w:r>
+          </w:p>
+        </w:tc>
+        <w:tc>
+          <w:tcPr/>
+          <w:p>
+            <w:pPr>
+              <w:pStyle w:val="Compact"/>
+              <w:jc w:val="right"/>
+            </w:pPr>
+            <w:r>
+              <w:t xml:space="preserve">s/d</w:t>
+            </w:r>
+          </w:p>
+        </w:tc>
+        <w:tc>
+          <w:tcPr/>
+          <w:p>
+            <w:pPr>
+              <w:pStyle w:val="Compact"/>
+              <w:jc w:val="right"/>
+            </w:pPr>
+            <w:r>
+              <w:t xml:space="preserve">14.823 familias</w:t>
+            </w:r>
+          </w:p>
+        </w:tc>
+        <w:tc>
+          <w:tcPr/>
+          <w:p>
+            <w:pPr>
+              <w:pStyle w:val="Compact"/>
+              <w:jc w:val="right"/>
+            </w:pPr>
+            <w:r>
+              <w:t xml:space="preserve">&gt; 21.000 personas</w:t>
+            </w:r>
+          </w:p>
+        </w:tc>
+      </w:tr>
+    </w:tbl>
+    <w:p>
+      <w:pPr>
+        <w:pStyle w:val="BodyText"/>
+      </w:pPr>
+      <w:r>
+        <w:rPr>
+          <w:b/>
+          <w:bCs/>
+        </w:rPr>
+        <w:t xml:space="preserve">Cómo leer la tabla.</w:t>
+      </w:r>
+      <w:r>
+        <w:t xml:space="preserve"> </w:t>
+      </w:r>
+      <w:r>
+        <w:t xml:space="preserve">La severidad se ordena por el</w:t>
+      </w:r>
+      <w:r>
+        <w:t xml:space="preserve"> </w:t>
+      </w:r>
+      <w:r>
+        <w:rPr>
+          <w:b/>
+          <w:bCs/>
+        </w:rPr>
+        <w:t xml:space="preserve">nivel del río</w:t>
+      </w:r>
+      <w:r>
+        <w:t xml:space="preserve"> </w:t>
+      </w:r>
+      <w:r>
+        <w:t xml:space="preserve">(5,5 &lt; 7,57 &lt;</w:t>
+      </w:r>
+      <w:r>
+        <w:t xml:space="preserve"> </w:t>
+      </w:r>
+      <w:r>
+        <w:t xml:space="preserve">7,84 m) y por la</w:t>
+      </w:r>
+      <w:r>
+        <w:t xml:space="preserve"> </w:t>
+      </w:r>
+      <w:r>
+        <w:rPr>
+          <w:b/>
+          <w:bCs/>
+        </w:rPr>
+        <w:t xml:space="preserve">afectación observada</w:t>
+      </w:r>
+      <w:r>
+        <w:t xml:space="preserve">, no por la cifra modelada: la huella satelital</w:t>
+      </w:r>
+      <w:r>
+        <w:t xml:space="preserve"> </w:t>
+      </w:r>
+      <w:r>
+        <w:t xml:space="preserve">de 2018-19 abarca más área urbana poblada que la de 2015-16, por lo que</w:t>
+      </w:r>
+      <w:r>
+        <w:t xml:space="preserve"> </w:t>
+      </w:r>
+      <w:r>
+        <w:rPr>
+          <w:i/>
+          <w:iCs/>
+        </w:rPr>
+        <w:t xml:space="preserve">captura</w:t>
+      </w:r>
+      <w:r>
+        <w:t xml:space="preserve"> </w:t>
+      </w:r>
+      <w:r>
+        <w:t xml:space="preserve">más</w:t>
+      </w:r>
+      <w:r>
+        <w:t xml:space="preserve"> </w:t>
+      </w:r>
+      <w:r>
+        <w:t xml:space="preserve">población pese a que 2015-16 tuvo el pico más alto y más desplazados. Las dos cifras</w:t>
+      </w:r>
+      <w:r>
+        <w:t xml:space="preserve"> </w:t>
+      </w:r>
+      <w:r>
+        <w:t xml:space="preserve">modeladas son del</w:t>
+      </w:r>
+      <w:r>
+        <w:t xml:space="preserve"> </w:t>
+      </w:r>
+      <w:r>
+        <w:rPr>
+          <w:b/>
+          <w:bCs/>
+        </w:rPr>
+        <w:t xml:space="preserve">mismo orden</w:t>
+      </w:r>
+      <w:r>
+        <w:t xml:space="preserve"> </w:t>
+      </w:r>
+      <w:r>
+        <w:t xml:space="preserve">(~35-40 mil) y caen dentro de la incertidumbre del</w:t>
+      </w:r>
+      <w:r>
+        <w:t xml:space="preserve"> </w:t>
+      </w:r>
+      <w:r>
+        <w:t xml:space="preserve">modelo.</w:t>
+      </w:r>
+      <w:r>
+        <w:t xml:space="preserve"> </w:t>
+      </w:r>
+      <w:r>
+        <w:rPr>
+          <w:b/>
+          <w:bCs/>
+        </w:rPr>
+        <w:t xml:space="preserve">Exposición modelada</w:t>
+      </w:r>
+      <w:r>
+        <w:t xml:space="preserve"> </w:t>
+      </w:r>
+      <w:r>
+        <w:t xml:space="preserve">(población que vive en la huella) y</w:t>
+      </w:r>
+      <w:r>
+        <w:t xml:space="preserve"> </w:t>
+      </w:r>
+      <w:r>
+        <w:rPr>
+          <w:b/>
+          <w:bCs/>
+        </w:rPr>
+        <w:t xml:space="preserve">afectación</w:t>
+      </w:r>
+      <w:r>
+        <w:rPr>
+          <w:b/>
+          <w:bCs/>
+        </w:rPr>
+        <w:t xml:space="preserve"> </w:t>
+      </w:r>
+      <w:r>
+        <w:rPr>
+          <w:b/>
+          <w:bCs/>
+        </w:rPr>
+        <w:t xml:space="preserve">observada</w:t>
+      </w:r>
+      <w:r>
+        <w:t xml:space="preserve"> </w:t>
+      </w:r>
+      <w:r>
+        <w:t xml:space="preserve">(desplazados reales) miden cosas distintas y no son intercambiables; además,</w:t>
+      </w:r>
+      <w:r>
+        <w:t xml:space="preserve"> </w:t>
+      </w:r>
+      <w:r>
+        <w:t xml:space="preserve">las huellas Sentinel-1 son</w:t>
+      </w:r>
+      <w:r>
+        <w:t xml:space="preserve"> </w:t>
+      </w:r>
+      <w:r>
+        <w:rPr>
+          <w:b/>
+          <w:bCs/>
+        </w:rPr>
+        <w:t xml:space="preserve">preliminares</w:t>
+      </w:r>
+      <w:r>
+        <w:t xml:space="preserve"> </w:t>
+      </w:r>
+      <w:r>
+        <w:t xml:space="preserve">(sin validación de campo), por lo que las</w:t>
+      </w:r>
+      <w:r>
+        <w:t xml:space="preserve"> </w:t>
+      </w:r>
+      <w:r>
+        <w:t xml:space="preserve">cifras modeladas son</w:t>
+      </w:r>
+      <w:r>
+        <w:t xml:space="preserve"> </w:t>
+      </w:r>
+      <w:r>
+        <w:rPr>
+          <w:b/>
+          <w:bCs/>
+        </w:rPr>
+        <w:t xml:space="preserve">órdenes de magnitud</w:t>
+      </w:r>
+      <w:r>
+        <w:t xml:space="preserve">.</w:t>
+      </w:r>
+    </w:p>
+    <w:bookmarkEnd w:id="17"/>
+    <w:bookmarkStart w:id="19" w:name="medidas-por-escenario"/>
+    <w:p>
+      <w:pPr>
+        <w:pStyle w:val="Heading2"/>
+      </w:pPr>
+      <w:r>
+        <w:t xml:space="preserve">Medidas por escenario</w:t>
+      </w:r>
+    </w:p>
+    <w:p>
+      <w:pPr>
+        <w:pStyle w:val="FirstParagraph"/>
+      </w:pPr>
+      <w:r>
+        <w:t xml:space="preserve">Siguen la lógica de la</w:t>
+      </w:r>
+      <w:r>
+        <w:t xml:space="preserve"> </w:t>
+      </w:r>
+      <w:r>
+        <w:rPr>
+          <w:b/>
+          <w:bCs/>
+        </w:rPr>
+        <w:t xml:space="preserve">acción anticipatoria</w:t>
+      </w:r>
+      <w:r>
+        <w:t xml:space="preserve"> </w:t>
+      </w:r>
+      <w:r>
+        <w:t xml:space="preserve">(actuar por disparador, antes del</w:t>
+      </w:r>
+      <w:r>
+        <w:t xml:space="preserve"> </w:t>
+      </w:r>
+      <w:r>
+        <w:t xml:space="preserve">impacto). Los pasos operativos detallados están en los</w:t>
+      </w:r>
+      <w:r>
+        <w:t xml:space="preserve"> </w:t>
+      </w:r>
+      <w:r>
+        <w:rPr>
+          <w:b/>
+          <w:bCs/>
+        </w:rPr>
+        <w:t xml:space="preserve">Protocolos de actuación</w:t>
+      </w:r>
+      <w:r>
+        <w:t xml:space="preserve"> </w:t>
+      </w:r>
+      <w:r>
+        <w:t xml:space="preserve">más</w:t>
+      </w:r>
+      <w:r>
+        <w:t xml:space="preserve"> </w:t>
+      </w:r>
+      <w:r>
+        <w:t xml:space="preserve">abajo.</w:t>
+      </w:r>
+    </w:p>
+    <w:p>
+      <w:pPr>
+        <w:pStyle w:val="BodyText"/>
+      </w:pPr>
+      <w:r>
+        <w:rPr>
+          <w:b/>
+          <w:bCs/>
+        </w:rPr>
+        <w:t xml:space="preserve">Escenario 1 · Esperado (pluvial).</w:t>
+      </w:r>
+      <w:r>
+        <w:t xml:space="preserve"> </w:t>
+      </w:r>
+      <w:r>
+        <w:rPr>
+          <w:i/>
+          <w:iCs/>
+        </w:rPr>
+        <w:t xml:space="preserve">Disparador: aviso de temporal de la DINAC.</w:t>
+      </w:r>
+      <w:r>
+        <w:t xml:space="preserve"> </w:t>
+      </w:r>
+      <w:r>
+        <w:t xml:space="preserve">Vigilar avisos; mantener</w:t>
+      </w:r>
+      <w:r>
+        <w:t xml:space="preserve"> </w:t>
+      </w:r>
+      <w:r>
+        <w:rPr>
+          <w:b/>
+          <w:bCs/>
+        </w:rPr>
+        <w:t xml:space="preserve">desagües limpios</w:t>
+      </w:r>
+      <w:r>
+        <w:t xml:space="preserve"> </w:t>
+      </w:r>
+      <w:r>
+        <w:t xml:space="preserve">y ordenar la</w:t>
+      </w:r>
+      <w:r>
+        <w:t xml:space="preserve"> </w:t>
+      </w:r>
+      <w:r>
+        <w:rPr>
+          <w:b/>
+          <w:bCs/>
+        </w:rPr>
+        <w:t xml:space="preserve">gestión de residuos</w:t>
+      </w:r>
+      <w:r>
+        <w:t xml:space="preserve">;</w:t>
+      </w:r>
+      <w:r>
+        <w:t xml:space="preserve"> </w:t>
+      </w:r>
+      <w:r>
+        <w:t xml:space="preserve">señalizar</w:t>
+      </w:r>
+      <w:r>
+        <w:t xml:space="preserve"> </w:t>
+      </w:r>
+      <w:r>
+        <w:rPr>
+          <w:b/>
+          <w:bCs/>
+        </w:rPr>
+        <w:t xml:space="preserve">puntos críticos</w:t>
+      </w:r>
+      <w:r>
+        <w:t xml:space="preserve"> </w:t>
+      </w:r>
+      <w:r>
+        <w:t xml:space="preserve">de raudal; activar el</w:t>
+      </w:r>
+      <w:r>
+        <w:t xml:space="preserve"> </w:t>
+      </w:r>
+      <w:r>
+        <w:rPr>
+          <w:b/>
+          <w:bCs/>
+        </w:rPr>
+        <w:t xml:space="preserve">protocolo de suspensión de clases</w:t>
+      </w:r>
+      <w:r>
+        <w:t xml:space="preserve"> </w:t>
+      </w:r>
+      <w:r>
+        <w:t xml:space="preserve">por jornada;</w:t>
+      </w:r>
+      <w:r>
+        <w:t xml:space="preserve"> </w:t>
+      </w:r>
+      <w:r>
+        <w:rPr>
+          <w:b/>
+          <w:bCs/>
+        </w:rPr>
+        <w:t xml:space="preserve">control vectorial</w:t>
+      </w:r>
+      <w:r>
+        <w:t xml:space="preserve"> </w:t>
+      </w:r>
+      <w:r>
+        <w:t xml:space="preserve">preventivo del verano (dengue).</w:t>
+      </w:r>
+    </w:p>
+    <w:p>
+      <w:pPr>
+        <w:pStyle w:val="BodyText"/>
+      </w:pPr>
+      <w:r>
+        <w:rPr>
+          <w:b/>
+          <w:bCs/>
+        </w:rPr>
+        <w:t xml:space="preserve">Escenario 2 · Severo (crecida fluvial).</w:t>
+      </w:r>
+      <w:r>
+        <w:t xml:space="preserve"> </w:t>
+      </w:r>
+      <w:r>
+        <w:rPr>
+          <w:i/>
+          <w:iCs/>
+        </w:rPr>
+        <w:t xml:space="preserve">Disparador: cota del río en ascenso hacia</w:t>
+      </w:r>
+      <w:r>
+        <w:rPr>
+          <w:i/>
+          <w:iCs/>
+        </w:rPr>
+        <w:t xml:space="preserve"> </w:t>
+      </w:r>
+      <w:r>
+        <w:rPr>
+          <w:i/>
+          <w:iCs/>
+        </w:rPr>
+        <w:t xml:space="preserve">5,5 m.</w:t>
+      </w:r>
+      <w:r>
+        <w:t xml:space="preserve"> </w:t>
+      </w:r>
+      <w:r>
+        <w:t xml:space="preserve">Activar el</w:t>
+      </w:r>
+      <w:r>
+        <w:t xml:space="preserve"> </w:t>
+      </w:r>
+      <w:r>
+        <w:rPr>
+          <w:b/>
+          <w:bCs/>
+        </w:rPr>
+        <w:t xml:space="preserve">plan de contingencia por inundación</w:t>
+      </w:r>
+      <w:r>
+        <w:t xml:space="preserve"> </w:t>
+      </w:r>
+      <w:r>
+        <w:t xml:space="preserve">de la SEN según la cota;</w:t>
+      </w:r>
+      <w:r>
+        <w:t xml:space="preserve"> </w:t>
+      </w:r>
+      <w:r>
+        <w:rPr>
+          <w:b/>
+          <w:bCs/>
+        </w:rPr>
+        <w:t xml:space="preserve">preavisar y preparar la evacuación</w:t>
+      </w:r>
+      <w:r>
+        <w:t xml:space="preserve"> </w:t>
+      </w:r>
+      <w:r>
+        <w:t xml:space="preserve">de los bañados (unas 40 mil personas en la</w:t>
+      </w:r>
+      <w:r>
+        <w:t xml:space="preserve"> </w:t>
+      </w:r>
+      <w:r>
+        <w:t xml:space="preserve">huella, con ~7.700 niñas y niños); asegurar</w:t>
+      </w:r>
+      <w:r>
+        <w:t xml:space="preserve"> </w:t>
+      </w:r>
+      <w:r>
+        <w:rPr>
+          <w:b/>
+          <w:bCs/>
+        </w:rPr>
+        <w:t xml:space="preserve">albergues</w:t>
+      </w:r>
+      <w:r>
+        <w:t xml:space="preserve"> </w:t>
+      </w:r>
+      <w:r>
+        <w:t xml:space="preserve">y agua segura;</w:t>
+      </w:r>
+      <w:r>
+        <w:t xml:space="preserve"> </w:t>
+      </w:r>
+      <w:r>
+        <w:rPr>
+          <w:b/>
+          <w:bCs/>
+        </w:rPr>
+        <w:t xml:space="preserve">continuidad</w:t>
+      </w:r>
+      <w:r>
+        <w:rPr>
+          <w:b/>
+          <w:bCs/>
+        </w:rPr>
+        <w:t xml:space="preserve"> </w:t>
+      </w:r>
+      <w:r>
+        <w:rPr>
+          <w:b/>
+          <w:bCs/>
+        </w:rPr>
+        <w:t xml:space="preserve">educativa</w:t>
+      </w:r>
+      <w:r>
+        <w:t xml:space="preserve"> </w:t>
+      </w:r>
+      <w:r>
+        <w:t xml:space="preserve">para las ~14 escuelas de la zona;</w:t>
+      </w:r>
+      <w:r>
+        <w:t xml:space="preserve"> </w:t>
+      </w:r>
+      <w:r>
+        <w:rPr>
+          <w:b/>
+          <w:bCs/>
+        </w:rPr>
+        <w:t xml:space="preserve">proteger los servicios de salud</w:t>
+      </w:r>
+      <w:r>
+        <w:t xml:space="preserve"> </w:t>
+      </w:r>
+      <w:r>
+        <w:t xml:space="preserve">expuestos;</w:t>
+      </w:r>
+      <w:r>
+        <w:t xml:space="preserve"> </w:t>
+      </w:r>
+      <w:r>
+        <w:rPr>
+          <w:b/>
+          <w:bCs/>
+        </w:rPr>
+        <w:t xml:space="preserve">control vectorial posinundación</w:t>
+      </w:r>
+      <w:r>
+        <w:t xml:space="preserve">.</w:t>
+      </w:r>
+    </w:p>
+    <w:p>
+      <w:pPr>
+        <w:pStyle w:val="BodyText"/>
+      </w:pPr>
+      <w:r>
+        <w:rPr>
+          <w:b/>
+          <w:bCs/>
+        </w:rPr>
+        <w:t xml:space="preserve">Escenario 3 · Extremo (crecida mayor + amenazas encadenadas).</w:t>
+      </w:r>
+      <w:r>
+        <w:t xml:space="preserve"> </w:t>
+      </w:r>
+      <w:r>
+        <w:rPr>
+          <w:i/>
+          <w:iCs/>
+        </w:rPr>
+        <w:t xml:space="preserve">Disparador: cota ≥</w:t>
+      </w:r>
+      <w:r>
+        <w:rPr>
+          <w:i/>
+          <w:iCs/>
+        </w:rPr>
+        <w:t xml:space="preserve"> </w:t>
+      </w:r>
+      <w:r>
+        <w:rPr>
+          <w:i/>
+          <w:iCs/>
+        </w:rPr>
+        <w:t xml:space="preserve">7,5 m o pronóstico de crecida excepcional.</w:t>
+      </w:r>
+      <w:r>
+        <w:t xml:space="preserve"> </w:t>
+      </w:r>
+      <w:r>
+        <w:t xml:space="preserve">Escala máxima:</w:t>
+      </w:r>
+      <w:r>
+        <w:t xml:space="preserve"> </w:t>
+      </w:r>
+      <w:r>
+        <w:rPr>
+          <w:b/>
+          <w:bCs/>
+        </w:rPr>
+        <w:t xml:space="preserve">declaración de emergencia</w:t>
+      </w:r>
+      <w:r>
+        <w:t xml:space="preserve"> </w:t>
+      </w:r>
+      <w:r>
+        <w:t xml:space="preserve">(antecedente: Ley N.º 6502/2020) y</w:t>
+      </w:r>
+      <w:r>
+        <w:t xml:space="preserve"> </w:t>
+      </w:r>
+      <w:r>
+        <w:rPr>
+          <w:b/>
+          <w:bCs/>
+        </w:rPr>
+        <w:t xml:space="preserve">coordinación multinivel</w:t>
+      </w:r>
+      <w:r>
+        <w:t xml:space="preserve">;</w:t>
+      </w:r>
+      <w:r>
+        <w:t xml:space="preserve"> </w:t>
+      </w:r>
+      <w:r>
+        <w:rPr>
+          <w:b/>
+          <w:bCs/>
+        </w:rPr>
+        <w:t xml:space="preserve">albergues masivos</w:t>
+      </w:r>
+      <w:r>
+        <w:t xml:space="preserve">;</w:t>
+      </w:r>
+      <w:r>
+        <w:t xml:space="preserve"> </w:t>
+      </w:r>
+      <w:r>
+        <w:t xml:space="preserve">salud con</w:t>
+      </w:r>
+      <w:r>
+        <w:t xml:space="preserve"> </w:t>
+      </w:r>
+      <w:r>
+        <w:rPr>
+          <w:b/>
+          <w:bCs/>
+        </w:rPr>
+        <w:t xml:space="preserve">vigilancia de brotes</w:t>
+      </w:r>
+      <w:r>
+        <w:t xml:space="preserve"> </w:t>
+      </w:r>
+      <w:r>
+        <w:t xml:space="preserve">(dengue, diarreas, respiratorias);</w:t>
+      </w:r>
+      <w:r>
+        <w:t xml:space="preserve"> </w:t>
+      </w:r>
+      <w:r>
+        <w:rPr>
+          <w:b/>
+          <w:bCs/>
+        </w:rPr>
+        <w:t xml:space="preserve">protección de la</w:t>
+      </w:r>
+      <w:r>
+        <w:rPr>
+          <w:b/>
+          <w:bCs/>
+        </w:rPr>
+        <w:t xml:space="preserve"> </w:t>
+      </w:r>
+      <w:r>
+        <w:rPr>
+          <w:b/>
+          <w:bCs/>
+        </w:rPr>
+        <w:t xml:space="preserve">niñez</w:t>
+      </w:r>
+      <w:r>
+        <w:t xml:space="preserve"> </w:t>
+      </w:r>
+      <w:r>
+        <w:t xml:space="preserve">con apoyo psicosocial; reconstrucción con criterio de</w:t>
+      </w:r>
+      <w:r>
+        <w:t xml:space="preserve"> </w:t>
+      </w:r>
+      <w:r>
+        <w:rPr>
+          <w:b/>
+          <w:bCs/>
+        </w:rPr>
+        <w:t xml:space="preserve">reducción de riesgo</w:t>
+      </w:r>
+      <w:r>
+        <w:t xml:space="preserve"> </w:t>
+      </w:r>
+      <w:r>
+        <w:t xml:space="preserve">(no</w:t>
+      </w:r>
+      <w:r>
+        <w:t xml:space="preserve"> </w:t>
+      </w:r>
+      <w:r>
+        <w:t xml:space="preserve">volver a exponer).</w:t>
+      </w:r>
+    </w:p>
+    <w:p>
+      <w:pPr>
+        <w:pStyle w:val="BlockText"/>
+      </w:pPr>
+      <w:r>
+        <w:t xml:space="preserve">Detalle y datos en vivo en el sitio:</w:t>
+      </w:r>
+      <w:r>
+        <w:t xml:space="preserve"> </w:t>
+      </w:r>
+      <w:r>
+        <w:rPr>
+          <w:b/>
+          <w:bCs/>
+        </w:rPr>
+        <w:t xml:space="preserve">Escenarios de riesgo</w:t>
+      </w:r>
+      <w:r>
+        <w:t xml:space="preserve"> </w:t>
+      </w:r>
+      <w:r>
+        <w:t xml:space="preserve">—</w:t>
+      </w:r>
+      <w:r>
+        <w:t xml:space="preserve"> </w:t>
+      </w:r>
+      <w:hyperlink r:id="rId18">
+        <w:r>
+          <w:rPr>
+            <w:rStyle w:val="Hyperlink"/>
+          </w:rPr>
+          <w:t xml:space="preserve">https://desastresanunciados.org/escenarios/</w:t>
+        </w:r>
+      </w:hyperlink>
+      <w:r>
+        <w:t xml:space="preserve">.</w:t>
+      </w:r>
+    </w:p>
+    <w:p>
+      <w:r>
+        <w:br w:type="page"/>
+      </w:r>
+    </w:p>
+    <w:bookmarkEnd w:id="19"/>
+    <w:bookmarkEnd w:id="20"/>
+    <w:bookmarkStart w:id="27" w:name="X0cf2b25fa38a48424544e6514685921bd9ac587"/>
+    <w:p>
+      <w:pPr>
+        <w:pStyle w:val="Heading1"/>
+      </w:pPr>
+      <w:r>
         <w:t xml:space="preserve">Recomendaciones para la comunidad académica de la Facultad de Ciencias Sociales (UNA)</w:t>
       </w:r>
     </w:p>
@@ -923,7 +2675,7 @@
         <w:t xml:space="preserve">extensión). El enfoque es doble —reactivo y proactivo—.</w:t>
       </w:r>
     </w:p>
-    <w:bookmarkStart w:id="16" w:name="continuidad-de-las-clases"/>
+    <w:bookmarkStart w:id="21" w:name="continuidad-de-las-clases"/>
     <w:p>
       <w:pPr>
         <w:pStyle w:val="Heading2"/>
@@ -1100,8 +2852,8 @@
         <w:t xml:space="preserve">intermitente) que no penalice a quien fue afectado por el evento.</w:t>
       </w:r>
     </w:p>
-    <w:bookmarkEnd w:id="16"/>
-    <w:bookmarkStart w:id="17" w:name="Xc1acf40fc4ded803b55e99d00e92c1fb96bdd4c"/>
+    <w:bookmarkEnd w:id="21"/>
+    <w:bookmarkStart w:id="22" w:name="Xc1acf40fc4ded803b55e99d00e92c1fb96bdd4c"/>
     <w:p>
       <w:pPr>
         <w:pStyle w:val="Heading2"/>
@@ -1176,7 +2928,21 @@
           <w:b/>
           <w:bCs/>
         </w:rPr>
-        <w:t xml:space="preserve">cambio climático</w:t>
+        <w:t xml:space="preserve">cambio</w:t>
+      </w:r>
+      <w:r>
+        <w:rPr>
+          <w:b/>
+          <w:bCs/>
+        </w:rPr>
+        <w:t xml:space="preserve"> </w:t>
+      </w:r>
+      <w:r>
+        <w:rPr>
+          <w:b/>
+          <w:bCs/>
+        </w:rPr>
+        <w:t xml:space="preserve">climático</w:t>
       </w:r>
       <w:r>
         <w:t xml:space="preserve"> </w:t>
@@ -1198,8 +2964,8 @@
         <w:t xml:space="preserve">, con enfoque de género y territorio.</w:t>
       </w:r>
     </w:p>
-    <w:bookmarkEnd w:id="17"/>
-    <w:bookmarkStart w:id="18" w:name="investigación"/>
+    <w:bookmarkEnd w:id="22"/>
+    <w:bookmarkStart w:id="23" w:name="investigación"/>
     <w:p>
       <w:pPr>
         <w:pStyle w:val="Heading2"/>
@@ -1335,8 +3101,8 @@
         <w:t xml:space="preserve">comunidades ribereñas afectadas.</w:t>
       </w:r>
     </w:p>
-    <w:bookmarkEnd w:id="18"/>
-    <w:bookmarkStart w:id="19" w:name="extensión-y-vínculo-con-el-territorio"/>
+    <w:bookmarkEnd w:id="23"/>
+    <w:bookmarkStart w:id="24" w:name="extensión-y-vínculo-con-el-territorio"/>
     <w:p>
       <w:pPr>
         <w:pStyle w:val="Heading2"/>
@@ -1441,8 +3207,8 @@
         <w:t xml:space="preserve">desde la facultad.</w:t>
       </w:r>
     </w:p>
-    <w:bookmarkEnd w:id="19"/>
-    <w:bookmarkStart w:id="20" w:name="X56a6e0b8c17c37d3291b080ef293b07f08ad0ca"/>
+    <w:bookmarkEnd w:id="24"/>
+    <w:bookmarkStart w:id="25" w:name="X56a6e0b8c17c37d3291b080ef293b07f08ad0ca"/>
     <w:p>
       <w:pPr>
         <w:pStyle w:val="Heading2"/>
@@ -1476,13 +3242,13 @@
         <w:t xml:space="preserve"> </w:t>
       </w:r>
       <w:r>
-        <w:t xml:space="preserve">o dependen de transporte vulnerable:</w:t>
-      </w:r>
-      <w:r>
-        <w:t xml:space="preserve"> </w:t>
-      </w:r>
-      <w:r>
-        <w:t xml:space="preserve">prever</w:t>
+        <w:t xml:space="preserve">o dependen de transporte</w:t>
+      </w:r>
+      <w:r>
+        <w:t xml:space="preserve"> </w:t>
+      </w:r>
+      <w:r>
+        <w:t xml:space="preserve">vulnerable: prever</w:t>
       </w:r>
       <w:r>
         <w:t xml:space="preserve"> </w:t>
@@ -1583,8 +3349,8 @@
         <w:t xml:space="preserve">evacuación señalizadas.</w:t>
       </w:r>
     </w:p>
-    <w:bookmarkEnd w:id="20"/>
-    <w:bookmarkStart w:id="21" w:name="cronograma-sugerido"/>
+    <w:bookmarkEnd w:id="25"/>
+    <w:bookmarkStart w:id="26" w:name="cronograma-sugerido"/>
     <w:p>
       <w:pPr>
         <w:pStyle w:val="Heading2"/>
@@ -1739,9 +3505,9 @@
         <w:br w:type="page"/>
       </w:r>
     </w:p>
-    <w:bookmarkEnd w:id="21"/>
-    <w:bookmarkEnd w:id="22"/>
-    <w:bookmarkStart w:id="28" w:name="protocolos-de-actuación-gran-asunción"/>
+    <w:bookmarkEnd w:id="26"/>
+    <w:bookmarkEnd w:id="27"/>
+    <w:bookmarkStart w:id="33" w:name="protocolos-de-actuación-gran-asunción"/>
     <w:p>
       <w:pPr>
         <w:pStyle w:val="Heading1"/>
@@ -1802,7 +3568,7 @@
         <w:t xml:space="preserve">en la evidencia del proyecto.</w:t>
       </w:r>
     </w:p>
-    <w:bookmarkStart w:id="23" w:name="X7680b6ca5cc7a69520acaf791206cbd100b17b1"/>
+    <w:bookmarkStart w:id="28" w:name="X7680b6ca5cc7a69520acaf791206cbd100b17b1"/>
     <w:p>
       <w:pPr>
         <w:pStyle w:val="Heading2"/>
@@ -1910,23 +3676,37 @@
         <w:t xml:space="preserve"> </w:t>
       </w:r>
       <w:r>
-        <w:t xml:space="preserve">o pronóstico de temporal severo, se aplica el criterio</w:t>
-      </w:r>
-      <w:r>
-        <w:t xml:space="preserve"> </w:t>
-      </w:r>
-      <w:r>
-        <w:t xml:space="preserve">predefinido y se decide entre:</w:t>
-      </w:r>
-      <w:r>
-        <w:t xml:space="preserve"> </w:t>
-      </w:r>
-      <w:r>
-        <w:rPr>
-          <w:b/>
-          <w:bCs/>
-        </w:rPr>
-        <w:t xml:space="preserve">presencial · virtual · suspensión con recuperación</w:t>
+        <w:t xml:space="preserve">o pronóstico de temporal severo, se aplica el</w:t>
+      </w:r>
+      <w:r>
+        <w:t xml:space="preserve"> </w:t>
+      </w:r>
+      <w:r>
+        <w:t xml:space="preserve">criterio predefinido y se decide entre:</w:t>
+      </w:r>
+      <w:r>
+        <w:t xml:space="preserve"> </w:t>
+      </w:r>
+      <w:r>
+        <w:rPr>
+          <w:b/>
+          <w:bCs/>
+        </w:rPr>
+        <w:t xml:space="preserve">presencial · virtual · suspensión con</w:t>
+      </w:r>
+      <w:r>
+        <w:rPr>
+          <w:b/>
+          <w:bCs/>
+        </w:rPr>
+        <w:t xml:space="preserve"> </w:t>
+      </w:r>
+      <w:r>
+        <w:rPr>
+          <w:b/>
+          <w:bCs/>
+        </w:rPr>
+        <w:t xml:space="preserve">recuperación</w:t>
       </w:r>
       <w:r>
         <w:t xml:space="preserve">.</w:t>
@@ -1985,8 +3765,8 @@
         <w:t xml:space="preserve">.</w:t>
       </w:r>
     </w:p>
-    <w:bookmarkEnd w:id="23"/>
-    <w:bookmarkStart w:id="24" w:name="Xd2beb73e712729830cc9f84d79101b618df77ab"/>
+    <w:bookmarkEnd w:id="28"/>
+    <w:bookmarkStart w:id="29" w:name="Xd2beb73e712729830cc9f84d79101b618df77ab"/>
     <w:p>
       <w:pPr>
         <w:pStyle w:val="Heading2"/>
@@ -2104,13 +3884,13 @@
         <w:t xml:space="preserve">salida ordenada</w:t>
       </w:r>
       <w:r>
-        <w:t xml:space="preserve">; evitar avenidas y arroyos desbordados del</w:t>
-      </w:r>
-      <w:r>
-        <w:t xml:space="preserve"> </w:t>
-      </w:r>
-      <w:r>
-        <w:t xml:space="preserve">entorno.</w:t>
+        <w:t xml:space="preserve">; evitar avenidas y arroyos desbordados</w:t>
+      </w:r>
+      <w:r>
+        <w:t xml:space="preserve"> </w:t>
+      </w:r>
+      <w:r>
+        <w:t xml:space="preserve">del entorno.</w:t>
       </w:r>
     </w:p>
     <w:p>
@@ -2138,8 +3918,8 @@
         <w:t xml:space="preserve">.</w:t>
       </w:r>
     </w:p>
-    <w:bookmarkEnd w:id="24"/>
-    <w:bookmarkStart w:id="25" w:name="Xf69fe133cde78f24d381e05557c0392c12ef179"/>
+    <w:bookmarkEnd w:id="29"/>
+    <w:bookmarkStart w:id="30" w:name="Xf69fe133cde78f24d381e05557c0392c12ef179"/>
     <w:p>
       <w:pPr>
         <w:pStyle w:val="Heading2"/>
@@ -2263,8 +4043,8 @@
         <w:t xml:space="preserve">para su reconocimiento y la posterior recuperación.</w:t>
       </w:r>
     </w:p>
-    <w:bookmarkEnd w:id="25"/>
-    <w:bookmarkStart w:id="26" w:name="Xd8f1bbc2ea9b0d41dde86d31c7bf5ac7a662532"/>
+    <w:bookmarkEnd w:id="30"/>
+    <w:bookmarkStart w:id="31" w:name="Xd8f1bbc2ea9b0d41dde86d31c7bf5ac7a662532"/>
     <w:p>
       <w:pPr>
         <w:pStyle w:val="Heading2"/>
@@ -2363,8 +4143,8 @@
         <w:t xml:space="preserve">según el protocolo del MSPBS.</w:t>
       </w:r>
     </w:p>
-    <w:bookmarkEnd w:id="26"/>
-    <w:bookmarkStart w:id="27" w:name="Xfdf2a8c33d23ea35aa7e361d8f91e522bb305fc"/>
+    <w:bookmarkEnd w:id="31"/>
+    <w:bookmarkStart w:id="32" w:name="Xfdf2a8c33d23ea35aa7e361d8f91e522bb305fc"/>
     <w:p>
       <w:pPr>
         <w:pStyle w:val="Heading2"/>
@@ -2468,9 +4248,9 @@
         <w:br w:type="page"/>
       </w:r>
     </w:p>
-    <w:bookmarkEnd w:id="27"/>
-    <w:bookmarkEnd w:id="28"/>
-    <w:bookmarkStart w:id="29" w:name="conclusión"/>
+    <w:bookmarkEnd w:id="32"/>
+    <w:bookmarkEnd w:id="33"/>
+    <w:bookmarkStart w:id="34" w:name="conclusión"/>
     <w:p>
       <w:pPr>
         <w:pStyle w:val="Heading1"/>
@@ -2536,8 +4316,8 @@
         <w:t xml:space="preserve">previsible es más barato y más justo que responder tras el daño.</w:t>
       </w:r>
     </w:p>
-    <w:bookmarkEnd w:id="29"/>
-    <w:bookmarkStart w:id="33" w:name="fuentes"/>
+    <w:bookmarkEnd w:id="34"/>
+    <w:bookmarkStart w:id="41" w:name="fuentes"/>
     <w:p>
       <w:pPr>
         <w:pStyle w:val="Heading1"/>
@@ -2571,7 +4351,13 @@
         <w:t xml:space="preserve"> </w:t>
       </w:r>
       <w:r>
-        <w:t xml:space="preserve">(Aviso de El Niño, jul-2026).</w:t>
+        <w:t xml:space="preserve">(Aviso de El Niño,</w:t>
+      </w:r>
+      <w:r>
+        <w:t xml:space="preserve"> </w:t>
+      </w:r>
+      <w:r>
+        <w:t xml:space="preserve">jul-2026).</w:t>
       </w:r>
       <w:r>
         <w:t xml:space="preserve"> </w:t>
@@ -2636,7 +4422,13 @@
         <w:t xml:space="preserve"> </w:t>
       </w:r>
       <w:r>
-        <w:t xml:space="preserve">“El Niño poised to rank among the largest events in the historical record”</w:t>
+        <w:t xml:space="preserve">“El Niño poised to rank among the largest events in the</w:t>
+      </w:r>
+      <w:r>
+        <w:t xml:space="preserve"> </w:t>
+      </w:r>
+      <w:r>
+        <w:t xml:space="preserve">historical record”</w:t>
       </w:r>
       <w:r>
         <w:t xml:space="preserve"> </w:t>
@@ -2746,7 +4538,13 @@
         <w:t xml:space="preserve"> </w:t>
       </w:r>
       <w:r>
-        <w:t xml:space="preserve">“El Niño en Paraguay: advierten sobre lluvias intensas e inundaciones para finales de 2026”</w:t>
+        <w:t xml:space="preserve">“El Niño en Paraguay: advierten sobre lluvias intensas e inundaciones para</w:t>
+      </w:r>
+      <w:r>
+        <w:t xml:space="preserve"> </w:t>
+      </w:r>
+      <w:r>
+        <w:t xml:space="preserve">finales de 2026”</w:t>
       </w:r>
       <w:r>
         <w:t xml:space="preserve"> </w:t>
@@ -2757,7 +4555,7 @@
       <w:r>
         <w:t xml:space="preserve"> </w:t>
       </w:r>
-      <w:hyperlink r:id="rId30">
+      <w:hyperlink r:id="rId35">
         <w:r>
           <w:rPr>
             <w:rStyle w:val="Hyperlink"/>
@@ -2810,7 +4608,7 @@
         </w:numPr>
       </w:pPr>
       <w:r>
-        <w:t xml:space="preserve">INEE.</w:t>
+        <w:t xml:space="preserve">Municipalidad de Asunción (DGRRD).</w:t>
       </w:r>
       <w:r>
         <w:t xml:space="preserve"> </w:t>
@@ -2820,6 +4618,173 @@
           <w:i/>
           <w:iCs/>
         </w:rPr>
+        <w:t xml:space="preserve">La crecida del río desplazó a más de 47 mil</w:t>
+      </w:r>
+      <w:r>
+        <w:rPr>
+          <w:i/>
+          <w:iCs/>
+        </w:rPr>
+        <w:t xml:space="preserve"> </w:t>
+      </w:r>
+      <w:r>
+        <w:rPr>
+          <w:i/>
+          <w:iCs/>
+        </w:rPr>
+        <w:t xml:space="preserve">personas</w:t>
+      </w:r>
+      <w:r>
+        <w:t xml:space="preserve"> </w:t>
+      </w:r>
+      <w:r>
+        <w:t xml:space="preserve">(2019).</w:t>
+      </w:r>
+      <w:r>
+        <w:t xml:space="preserve"> </w:t>
+      </w:r>
+      <w:hyperlink r:id="rId36">
+        <w:r>
+          <w:rPr>
+            <w:rStyle w:val="Hyperlink"/>
+          </w:rPr>
+          <w:t xml:space="preserve">https://www.asuncion.gov.py/intendencia/la-crecida-del-rio-desplazo-a-mas-de-47-mil-personas</w:t>
+        </w:r>
+      </w:hyperlink>
+    </w:p>
+    <w:p>
+      <w:pPr>
+        <w:pStyle w:val="Compact"/>
+        <w:numPr>
+          <w:ilvl w:val="0"/>
+          <w:numId w:val="1011"/>
+        </w:numPr>
+      </w:pPr>
+      <w:r>
+        <w:t xml:space="preserve">Última Hora.</w:t>
+      </w:r>
+      <w:r>
+        <w:t xml:space="preserve"> </w:t>
+      </w:r>
+      <w:r>
+        <w:rPr>
+          <w:i/>
+          <w:iCs/>
+        </w:rPr>
+        <w:t xml:space="preserve">Más de 21.000 desplazados por inundaciones en Asunción</w:t>
+      </w:r>
+      <w:r>
+        <w:t xml:space="preserve"> </w:t>
+      </w:r>
+      <w:r>
+        <w:t xml:space="preserve">(2015-16).</w:t>
+      </w:r>
+      <w:r>
+        <w:t xml:space="preserve"> </w:t>
+      </w:r>
+      <w:hyperlink r:id="rId37">
+        <w:r>
+          <w:rPr>
+            <w:rStyle w:val="Hyperlink"/>
+          </w:rPr>
+          <w:t xml:space="preserve">https://www.ultimahora.com/mas-21000-desplazados-inundaciones-asuncion-n1130570.html</w:t>
+        </w:r>
+      </w:hyperlink>
+    </w:p>
+    <w:p>
+      <w:pPr>
+        <w:pStyle w:val="Compact"/>
+        <w:numPr>
+          <w:ilvl w:val="0"/>
+          <w:numId w:val="1011"/>
+        </w:numPr>
+      </w:pPr>
+      <w:r>
+        <w:t xml:space="preserve">FloodList.</w:t>
+      </w:r>
+      <w:r>
+        <w:t xml:space="preserve"> </w:t>
+      </w:r>
+      <w:r>
+        <w:rPr>
+          <w:i/>
+          <w:iCs/>
+        </w:rPr>
+        <w:t xml:space="preserve">Paraguay – Floods in Asunción</w:t>
+      </w:r>
+      <w:r>
+        <w:t xml:space="preserve"> </w:t>
+      </w:r>
+      <w:r>
+        <w:t xml:space="preserve">(crecida 2015-16, pico 7,84 m).</w:t>
+      </w:r>
+      <w:r>
+        <w:t xml:space="preserve"> </w:t>
+      </w:r>
+      <w:hyperlink r:id="rId38">
+        <w:r>
+          <w:rPr>
+            <w:rStyle w:val="Hyperlink"/>
+          </w:rPr>
+          <w:t xml:space="preserve">https://floodlist.com/south-america/paraguay-floods-asuncion-january-2016</w:t>
+        </w:r>
+      </w:hyperlink>
+    </w:p>
+    <w:p>
+      <w:pPr>
+        <w:pStyle w:val="Compact"/>
+        <w:numPr>
+          <w:ilvl w:val="0"/>
+          <w:numId w:val="1011"/>
+        </w:numPr>
+      </w:pPr>
+      <w:r>
+        <w:t xml:space="preserve">Escenarios y método de exposición: Proyecto</w:t>
+      </w:r>
+      <w:r>
+        <w:t xml:space="preserve"> </w:t>
+      </w:r>
+      <w:r>
+        <w:rPr>
+          <w:i/>
+          <w:iCs/>
+        </w:rPr>
+        <w:t xml:space="preserve">Desastres Anunciados</w:t>
+      </w:r>
+      <w:r>
+        <w:t xml:space="preserve">.</w:t>
+      </w:r>
+      <w:r>
+        <w:t xml:space="preserve"> </w:t>
+      </w:r>
+      <w:hyperlink r:id="rId18">
+        <w:r>
+          <w:rPr>
+            <w:rStyle w:val="Hyperlink"/>
+          </w:rPr>
+          <w:t xml:space="preserve">https://desastresanunciados.org/escenarios/</w:t>
+        </w:r>
+      </w:hyperlink>
+    </w:p>
+    <w:p>
+      <w:pPr>
+        <w:pStyle w:val="Compact"/>
+        <w:numPr>
+          <w:ilvl w:val="0"/>
+          <w:numId w:val="1011"/>
+        </w:numPr>
+      </w:pPr>
+      <w:r>
+        <w:t xml:space="preserve">INEE.</w:t>
+      </w:r>
+      <w:r>
+        <w:t xml:space="preserve"> </w:t>
+      </w:r>
+      <w:r>
+        <w:rPr>
+          <w:i/>
+          <w:iCs/>
+        </w:rPr>
         <w:t xml:space="preserve">Normas Mínimas para la Educación en Situaciones de Emergencia</w:t>
       </w:r>
       <w:r>
@@ -2828,7 +4793,7 @@
       <w:r>
         <w:t xml:space="preserve"> </w:t>
       </w:r>
-      <w:hyperlink r:id="rId31">
+      <w:hyperlink r:id="rId39">
         <w:r>
           <w:rPr>
             <w:rStyle w:val="Hyperlink"/>
@@ -2864,7 +4829,7 @@
       <w:r>
         <w:t xml:space="preserve"> </w:t>
       </w:r>
-      <w:hyperlink r:id="rId32">
+      <w:hyperlink r:id="rId40">
         <w:r>
           <w:rPr>
             <w:rStyle w:val="Hyperlink"/>
@@ -2873,7 +4838,7 @@
         </w:r>
       </w:hyperlink>
     </w:p>
-    <w:bookmarkEnd w:id="33"/>
+    <w:bookmarkEnd w:id="41"/>
     <w:sectPr>
       <w:footnotePr>
         <w:numRestart w:val="eachSect"/>

</xml_diff>